<commit_message>
SF30/31 TD2-bias fix + SF28 flowchart refresh; sync SF24-42 legends verbatim to PJC edits
- SF30/31: re-anchor to reference-AUG-traced stops (unbiased); restrict
  to Subset 2 (n=1,166 / n=1,050); drop Spearman for a Wilcoxon
  above/below-50nt threshold comparison; wire validate_figure_layout
  into both render scripts.
- SF28: font tier bumped to {14,18,22}; validator default updated
  accordingly; "Starting cohort" trimmed; new "Used by (whole pair set)"
  hub-consumer box (SF25/26/27/29) placed to the right of the hub via
  rank=same; Subset 2 "Used by" list adds SF30/31.
- SF24-27, SF29, SF32-42 legend .md's overwritten verbatim from the PJC
  docx (paper/nmd_supplemental_figures_sf24_sf42_PJC.docx); SF30/31 .md's
  kept — they carry the post-TD2-fix numbers and the PJC would regress.
- Supplemental docx rebuilt.

Co-Authored-By: Claude Opus 4.7 (1M context) <noreply@anthropic.com>
</commit_message>
<xml_diff>
--- a/paper/nmd_supplemental_figures_sf24_sf42.docx
+++ b/paper/nmd_supplemental_figures_sf24_sf42.docx
@@ -287,9 +287,9 @@
       <w:r>
         <w:drawing>
           <wp:inline distT="0" distB="0" distL="0" distR="0">
-            <wp:extent cx="5943600" cy="4705350"/>
+            <wp:extent cx="5943600" cy="4514850"/>
             <wp:effectExtent t="0" r="0" b="0" l="0"/>
-            <wp:docPr id="1" name="SF28_PairAnalysisFlowchart" descr="SF28 | Pair-analysis cohort flowchart." title="SF28 | Pair-analysis cohort flowchart."/>
+            <wp:docPr id="1" name="SF28_PairAnalysisFlowchart" descr="SF28 | Isopair analysis flowchart." title="SF28 | Isopair analysis flowchart."/>
             <wp:cNvGraphicFramePr>
               <a:graphicFrameLocks xmlns:a="http://schemas.openxmlformats.org/drawingml/2006/main" noChangeAspect="1"/>
             </wp:cNvGraphicFramePr>
@@ -312,7 +312,7 @@
                   <pic:spPr bwMode="auto">
                     <a:xfrm>
                       <a:off x="0" y="0"/>
-                      <a:ext cx="5943600" cy="4705350"/>
+                      <a:ext cx="5943600" cy="4514850"/>
                     </a:xfrm>
                     <a:prstGeom prst="rect">
                       <a:avLst/>
@@ -334,100 +334,10 @@
           <w:b/>
           <w:bCs/>
         </w:rPr>
-        <w:t xml:space="preserve">SF28 | Pair-analysis cohort flowchart. </w:t>
-      </w:r>
-      <w:r>
-        <w:t xml:space="preserve">Flow of the isoform-pair analyses, from the four-cell-type starting cohort through the two subsets used in the main figures and supplements. Every filter step shows the number of pairs kept and dropped, and a one-line description of why each dropout happened.</w:t>
-      </w:r>
-    </w:p>
-    <w:p>
-      <w:pPr>
-        <w:spacing w:after="120"/>
-      </w:pPr>
-      <w:r>
-        <w:rPr>
-          <w:b/>
-          <w:bCs/>
-        </w:rPr>
-        <w:t xml:space="preserve">Starting cohort and upstream steps (top column).</w:t>
-      </w:r>
-      <w:r>
-        <w:t xml:space="preserve"> The flowchart begins with the manuscript-scope cohort — 26 samples (AT2 n = 6, LAE n = 8, FB n = 6, MV n = 6) and 123,790 expressed isoforms. From this cohort each isoform is classified as NMD susceptible or non-NMD (per-cell-type + 4-cell-type-union mashr framework), and paired comparisons are constructed (per gene: the dominant NMD-susceptible isoform against a reference, together with two dominant non-NMD isoforms — one as reference, one as Control). Before gene-matching this produces 3,009 NMD-susceptible pair candidates and 8,323 Control pair candidates.</w:t>
-      </w:r>
-    </w:p>
-    <w:p>
-      <w:pPr>
-        <w:spacing w:after="120"/>
-      </w:pPr>
-      <w:r>
-        <w:rPr>
-          <w:b/>
-          <w:bCs/>
-        </w:rPr>
-        <w:t xml:space="preserve">Matched isoform pairs (central navy box).</w:t>
-      </w:r>
-      <w:r>
-        <w:t xml:space="preserve"> Pairs are then matched across the two arms so that each gene contributes a single triplet — one reference transcript, one NMD-susceptible comparator, and one Control comparator — yielding 3,009 NMD-susceptible pairs and 3,009 Control pairs. This central cohort is the starting point for both downstream subsets.</w:t>
-      </w:r>
-    </w:p>
-    <w:p>
-      <w:pPr>
-        <w:spacing w:after="120"/>
-      </w:pPr>
-      <w:r>
-        <w:rPr>
-          <w:b/>
-          <w:bCs/>
-        </w:rPr>
-        <w:t xml:space="preserve">GENCODE-restricted subset (left, orange cluster; n = 190).</w:t>
-      </w:r>
-      <w:r>
-        <w:t xml:space="preserve"> The strictest cohort: all three transcripts of the triplet are annotated coding transcripts (in GENCODE, with a curated coding sequence). Two filters reduce the starting 3,009 to 190 pairs. The first — requiring all three transcripts to be annotated — drops 2,708 pairs because most NMD-susceptible transcripts are novel isoforms discovered by long-read sequencing and are absent from GENCODE. The second — requiring a curated coding sequence on all three — drops a further 111 pairs that are annotated but non-coding (long non-coding RNAs and similar). The NMD-susceptible comparator in each of the 190 surviving pairs is then classified by whether its own annotated stop codon sits more than 50 nt before the last exon-exon junction: 72 are PTC+ (38 %), 118 are PTC−, and the 190 Control comparators are not stratified by PTC status. This subset is consumed by Figure 3 Panels D / E / F, Figure 4 Panels A / B, and SF32.</w:t>
-      </w:r>
-    </w:p>
-    <w:p>
-      <w:pPr>
-        <w:spacing w:after="120"/>
-      </w:pPr>
-      <w:r>
-        <w:rPr>
-          <w:b/>
-          <w:bCs/>
-        </w:rPr>
-        <w:t xml:space="preserve">Reference-AUG-traceable subset (right, blue cluster; n = 1,166).</w:t>
-      </w:r>
-      <w:r>
-        <w:t xml:space="preserve"> Broader cohort that keeps pairs where the NMD-susceptible or Control comparator is novel, as long as the reference transcript is annotated and the reference start codon can be projected onto the comparator. Three filters narrow the starting 3,009 to 1,166. Requiring the reference itself to be annotated drops 911 pairs whose reference is novel. Requiring that the genomic position of the reference start codon falls within an exon of the comparator drops a further 439 NMD-susceptible and 812 Control pairs whose comparator transcript is missing the relevant exon. Re-matching to keep only genes where this mapping succeeded on both arms drops 493 NMD-susceptible and 120 Control pairs, leaving 1,166 / 1,166. Each NMD-susceptible comparator is then classified by where the reference start codon — projected onto that comparator's transcript — leads: a premature stop versus an extended or matched open reading frame. 1,050 of 1,166 (90 %) carry a premature stop under this projection; 116 do not. This subset is consumed by Figure 4 Panels C / D and SF35.</w:t>
-      </w:r>
-    </w:p>
-    <w:p>
-      <w:pPr>
-        <w:spacing w:after="120"/>
-      </w:pPr>
-      <w:r>
-        <w:rPr>
-          <w:b/>
-          <w:bCs/>
-        </w:rPr>
-        <w:t xml:space="preserve">Occult-PTC sub-cascade (purple, off the reference-AUG-traceable subset; n = 492).</w:t>
-      </w:r>
-      <w:r>
-        <w:t xml:space="preserve"> Sub-subset of the reference-AUG-traceable subset in which the TransDecoder2 CDS caller (the program SQANTI3 uses to annotate novel isoforms) did not flag a premature stop, but the reference-anchored analysis did. 674 of the 1,166 pairs are dropped because there is either no premature stop at all or both methods agree. In the remaining 492 pairs, TransDecoder2 has selected a coding sequence that starts downstream of the reference start codon — long enough to extend the coding sequence past the would-be premature stop into an in-frame coding region. The biological ribosome would in general initiate at the upstream reference start codon, so TransDecoder2's downstream call misses a real NMD substrate. This subset is consumed by SF33/SF34.</w:t>
-      </w:r>
-    </w:p>
-    <w:p>
-      <w:pPr>
-        <w:spacing w:after="120"/>
-      </w:pPr>
-      <w:r>
-        <w:rPr>
-          <w:b/>
-          <w:bCs/>
-        </w:rPr>
-        <w:t xml:space="preserve">Colour coding.</w:t>
-      </w:r>
-      <w:r>
-        <w:t xml:space="preserve"> Dark slate, upstream steps (raw matrix to pair construction). Yellow, NMD classification and per-subset PTC classification. Dark navy, central matched-pair hub. Orange cluster, GENCODE-restricted subset. Blue cluster, reference-AUG-traceable subset. Purple, occult-PTC subset. Grey, downstream figure and supplement consumers.</w:t>
+        <w:t xml:space="preserve">SF28 | Isopair analysis flowchart. </w:t>
+      </w:r>
+      <w:r>
+        <w:t xml:space="preserve">Data flow for the isoform pairs analyses. Every filter step shows the number of pairs kept and dropped, and a one-line description of why each dropout happened.</w:t>
       </w:r>
     </w:p>
     <w:p>
@@ -559,7 +469,7 @@
         <w:t xml:space="preserve">SF30 | NMD-Response Magnitude vs Stop-Codon Distance to Last EJC. </w:t>
       </w:r>
       <w:r>
-        <w:t xml:space="preserve">Per-comparator NMD-response magnitude (mashr posterior-mean log2 fold-change under SMG1 inhibition, averaged across AT2, LAE, FB and MV) plotted against the distance from the comparator's stop codon to the transcript's last exon-junction complex. Positive values, stop codon upstream of the last EJC (candidate NMD substrate); negative values, stop codon downstream of the last EJC. Grey points, individual comparators (1st–99th percentile of x-axis shown); orange line, local-linear smoother; orange band, bootstrap 95% CI. Dashed red line, the operational 50-nt PTC threshold. Population: 2,790 gene-matched NMD comparators with both a stop-codon-to-last-EJC distance defined and a mashr posterior-mean estimate. Spearman ρ = 0.182, p = 3.9 × 10⁻²².</w:t>
+        <w:t xml:space="preserve">Per-comparator NMD-response magnitude (mashr posterior-mean log₂ fold-change under SMG1 inhibition, averaged across AT2, LAE, FB and MV) plotted against the distance from the comparator's stop codon to the transcript's last exon-junction complex. Positive values, stop codon upstream of the last EJC (candidate NMD substrate); negative values, stop codon downstream of the last EJC. Grey points, individual comparators (1st–99th percentile of x-axis shown); orange line, local-linear smoother; orange band, bootstrap 95% CI. Dashed red line, the operational 50-nt PTC threshold. Population: n = 1,166 comparators (all of Subset 2, gene-matched ref-AUG-traceable). Stop anchor: reference-AUG-traced (the first in-frame stop reached after projecting the reference gene's AUG onto the comparator); this avoids the attenuation that would arise from TD2 anchoring on non-PTC main ORFs. Median log₂ fold-change is 2.20 above the 50-nt threshold and 1.09 at or below it (Wilcoxon one-sided p = 1.1 × 10⁻²⁰).</w:t>
       </w:r>
     </w:p>
     <w:p>
@@ -625,7 +535,7 @@
         <w:t xml:space="preserve">SF31 | NMD Effect Size by Downstream EJC Count in PTC-Positive NMD Comparators. </w:t>
       </w:r>
       <w:r>
-        <w:t xml:space="preserve">Distribution of NMD-response magnitude (mashr posterior-mean log2 fold-change under SMG1 inhibition, averaged across AT2, LAE, FB and MV) as a function of the number of exon-junction complexes downstream of the comparator's stop codon. Restricted to PTC-positive NMD comparators (stop codon &gt; 50 nt upstream of the last EJC; n = 1,211) drawn from the same population as SF30. Downstream-EJC counts of 7 or more are collapsed into a single "7+" bin. Violin, kernel density; overlaid box, interquartile range and median; red line, per-bin median trend. Per-bin sample counts are shown above each violin.</w:t>
+        <w:t xml:space="preserve">Distribution of NMD-response magnitude (mashr posterior-mean log₂ fold-change under SMG1 inhibition, averaged across AT2, LAE, FB and MV) as a function of the number of exon-junction complexes downstream of the comparator's stop codon. Restricted to comparators with at least one downstream EJC (n = 1,050), drawn from the same Subset 2 population as SF30. Downstream-EJC counts of 7 or more are collapsed into a single "7+" bin. Violin, kernel density; overlaid box, interquartile range and median; red line, per-bin median trend. Per-bin sample counts are shown above each violin. Stop anchor: reference-AUG-traced, matching SF30.</w:t>
       </w:r>
     </w:p>
     <w:p>
@@ -707,135 +617,73 @@
         <w:spacing w:after="120"/>
       </w:pPr>
       <w:r>
-        <w:rPr>
-          <w:b/>
-          <w:bCs/>
-        </w:rPr>
-        <w:t xml:space="preserve">(A)</w:t>
-      </w:r>
-      <w:r>
-        <w:t xml:space="preserve"> Coding-sequence length is similar across the three groups in the annotated cohort (medians 760 / 834 / 968 nt). NMD-susceptible isoforms with a premature termination codon have a modestly shorter coding sequence than Controls (Hodges–Lehmann shift = −186 nt, p = 5×10⁻³), consistent with the premature termination codon truncating the open reading frame. Coding-sequence length is not a confound for the 5′UTR and 3′UTR differences shown in the other panels.</w:t>
-      </w:r>
-    </w:p>
-    <w:p>
-      <w:pPr>
-        <w:spacing w:after="120"/>
-      </w:pPr>
-      <w:r>
-        <w:rPr>
-          <w:b/>
-          <w:bCs/>
-        </w:rPr>
-        <w:t xml:space="preserve">(B)</w:t>
-      </w:r>
-      <w:r>
-        <w:t xml:space="preserve"> 3′UTR length under the translation-based measure (transcript length minus annotated stop position). NMD-susceptible isoforms with a premature termination codon appear to have substantially longer 3′UTRs than Controls (medians 869 vs 517 nt; p = 1×10⁻⁴), but this is a measurement artifact: the post-stop region in these isoforms includes the coding sequence between the premature stop and the natural stop.</w:t>
-      </w:r>
-    </w:p>
-    <w:p>
-      <w:pPr>
-        <w:spacing w:after="120"/>
-      </w:pPr>
-      <w:r>
-        <w:rPr>
-          <w:b/>
-          <w:bCs/>
-        </w:rPr>
-        <w:t xml:space="preserve">(C)</w:t>
-      </w:r>
-      <w:r>
-        <w:t xml:space="preserve"> 3′UTR length under the bias-corrected measure that walks past any premature stop codon (translates downstream from the annotated start, skipping stops that would themselves be classified as premature, until reaching the first non-premature stop). Under this corrected measure, NMD with a premature termination codon and Controls are indistinguishable (medians 524 vs 517 nt; p = 0.90), confirming that the apparent inflation in Panel B was the measurement, not the biology. NMD-susceptible isoforms without a premature termination codon retain a significantly shorter 3′UTR than Controls (median 384 vs 517 nt; p = 0.03). Six of the 72 NMD-with-PTC isoforms (8%) had no non-premature stop downstream in the comparator transcript and are dropped from this panel (n = 66 displayed).</w:t>
-      </w:r>
-    </w:p>
-    <w:p>
-      <w:pPr>
-        <w:spacing w:after="120"/>
-      </w:pPr>
-      <w:r>
-        <w:rPr>
-          <w:b/>
-          <w:bCs/>
-        </w:rPr>
-        <w:t xml:space="preserve">(D)</w:t>
-      </w:r>
-      <w:r>
-        <w:t xml:space="preserve"> Coding-sequence length on the broader cohort, anchored on the reference start codon projected onto the comparator. NMD-susceptible isoforms with a premature termination codon have the shortest open reading frame (median 579 nt vs 972 nt in Control), as expected from the premature stop. NMD-susceptible isoforms without a premature termination codon sit between (median 686 nt).</w:t>
-      </w:r>
-    </w:p>
-    <w:p>
-      <w:pPr>
-        <w:spacing w:after="120"/>
-      </w:pPr>
-      <w:r>
-        <w:rPr>
-          <w:b/>
-          <w:bCs/>
-        </w:rPr>
-        <w:t xml:space="preserve">(E)</w:t>
-      </w:r>
-      <w:r>
-        <w:t xml:space="preserve"> Translation-based 3′UTR length on the broader cohort. The same artifact apparent in Panel B is again present (median 2,018 nt in NMD+PTC vs 1,184 nt in Control).</w:t>
-      </w:r>
-    </w:p>
-    <w:p>
-      <w:pPr>
-        <w:spacing w:after="120"/>
-      </w:pPr>
-      <w:r>
-        <w:rPr>
-          <w:b/>
-          <w:bCs/>
-        </w:rPr>
-        <w:t xml:space="preserve">(F)</w:t>
-      </w:r>
-      <w:r>
-        <w:t xml:space="preserve"> Bias-corrected 3′UTR length on the broader cohort. After correction, NMD-with-PTC moves from 2,018 down to 1,290 nt, much closer to the Control median of 948 nt. The directional pattern from the annotated cohort is preserved at the broader cohort and remains statistically detectable, but it is quantitatively much smaller than the translation-based gap. This argues against extended 3′UTR length as the dominant mechanism for the residual NMD-without-PTC isoforms.</w:t>
-      </w:r>
-    </w:p>
-    <w:p>
-      <w:pPr>
-        <w:spacing w:after="120"/>
-      </w:pPr>
-      <w:r>
-        <w:t xml:space="preserve">Violins show per-group density on a log scale; horizontal lines mark q25 (dotted), median (dashed), and q75 (dotted). Stars: </w:t>
-      </w:r>
-      <w:r>
-        <w:rPr>
-          <w:b/>
-          <w:bCs/>
-        </w:rPr>
-        <w:t xml:space="preserve"/>
-      </w:r>
-      <w:r>
-        <w:t xml:space="preserve">p &lt; 10⁻¹⁰, </w:t>
-      </w:r>
-      <w:r>
-        <w:rPr>
-          <w:b/>
-          <w:bCs/>
-        </w:rPr>
-        <w:t xml:space="preserve">*p &lt; 10⁻⁴, </w:t>
-      </w:r>
-      <w:r>
-        <w:t xml:space="preserve">p &lt; 10⁻³, </w:t>
-      </w:r>
-      <w:r>
-        <w:t xml:space="preserve">*p &lt; 0.05, n.s. otherwise (two-sided Wilcoxon rank-sum).</w:t>
-      </w:r>
-    </w:p>
-    <w:p>
-      <w:pPr>
-        <w:spacing w:after="120"/>
-      </w:pPr>
-      <w:r>
-        <w:rPr>
-          <w:b/>
-          <w:bCs/>
-        </w:rPr>
-        <w:t xml:space="preserve">Abbreviations.</w:t>
-      </w:r>
-      <w:r>
-        <w:t xml:space="preserve"> NMD, nonsense-mediated decay; PTC, premature termination codon; CDS, coding sequence; UTR, untranslated region.</w:t>
+        <w:t xml:space="preserve">(A) Coding-sequence length is similar across the three groups in the annotated cohort (medians 760 / 834 / 968 nt). NMD-susceptible isoforms with a premature termination codon have a modestly shorter coding sequence than Controls (Hodges–Lehmann shift = −186 nt, p = 5×10⁻³), consistent with the premature termination codon truncating the open reading frame. Coding-sequence length is not a confound for the 5′UTR and 3′UTR differences shown in the other panels.</w:t>
+      </w:r>
+    </w:p>
+    <w:p>
+      <w:pPr>
+        <w:spacing w:after="120"/>
+      </w:pPr>
+      <w:r>
+        <w:t xml:space="preserve">(B) 3′UTR length under the translation-based measure (transcript length minus annotated stop position). NMD-susceptible isoforms with a premature termination codon appear to have substantially longer 3′UTRs than Controls (medians 869 vs 517 nt; p = 1×10⁻⁴), but this is a measurement artifact: the post-stop region in these isoforms includes the coding sequence between the premature stop and the natural stop.</w:t>
+      </w:r>
+    </w:p>
+    <w:p>
+      <w:pPr>
+        <w:spacing w:after="120"/>
+      </w:pPr>
+      <w:r>
+        <w:t xml:space="preserve">(C) 3′UTR length under the bias-corrected measure that walks past any premature stop codon (translates downstream from the annotated start, skipping stops that would themselves be classified as premature, until reaching the first non-premature stop). Under this corrected measure, NMD with a premature termination codon and Controls are indistinguishable (medians 524 vs 517 nt; p = 0.90), confirming that the apparent inflation in Panel B was the measurement, not the biology. NMD-susceptible isoforms without a premature termination codon retain a significantly shorter 3′UTR than Controls (median 384 vs 517 nt; p = 0.03). Six of the 72 NMD-with-PTC isoforms (8%) had no non-premature stop downstream in the comparator transcript and are dropped from this panel (n = 66 displayed).</w:t>
+      </w:r>
+    </w:p>
+    <w:p>
+      <w:pPr>
+        <w:spacing w:after="120"/>
+      </w:pPr>
+      <w:r>
+        <w:t xml:space="preserve">(D) Coding-sequence length on the broader cohort, anchored on the reference start codon projected onto the comparator. NMD-susceptible isoforms with a premature termination codon have the shortest open reading frame (median 579 nt vs 972 nt in Control), as expected from the premature stop. NMD-susceptible isoforms without a premature termination codon sit between (median 686 nt).</w:t>
+      </w:r>
+    </w:p>
+    <w:p>
+      <w:pPr>
+        <w:spacing w:after="120"/>
+      </w:pPr>
+      <w:r>
+        <w:t xml:space="preserve">(E) Translation-based 3′UTR length on the broader cohort. The same artifact apparent in Panel B is again present (median 2,018 nt in NMD+PTC vs 1,184 nt in Control).</w:t>
+      </w:r>
+    </w:p>
+    <w:p>
+      <w:pPr>
+        <w:spacing w:after="120"/>
+      </w:pPr>
+      <w:r>
+        <w:t xml:space="preserve">(F) Bias-corrected 3′UTR length on the broader cohort. After correction, NMD-with-PTC moves from 2,018 down to 1,290 nt, much closer to the Control median of 948 nt. The directional pattern from the annotated cohort is preserved at the broader cohort and remains statistically detectable, but it is quantitatively much smaller than the translation-based gap. This argues against extended 3′UTR length as the dominant mechanism for the residual NMD-without-PTC isoforms.</w:t>
+      </w:r>
+    </w:p>
+    <w:p>
+      <w:pPr>
+        <w:spacing w:after="120"/>
+      </w:pPr>
+      <w:r>
+        <w:t xml:space="preserve">Violins show per-group density on a log scale; horizontal lines mark q25 (dotted), median (dashed), and q75 (dotted). Stars: p &lt; 10⁻¹⁰, </w:t>
+      </w:r>
+      <w:r>
+        <w:rPr>
+          <w:i/>
+          <w:iCs/>
+        </w:rPr>
+        <w:t xml:space="preserve">p &lt; 10⁻⁴, p &lt; 10⁻³, </w:t>
+      </w:r>
+      <w:r>
+        <w:t xml:space="preserve">p &lt; 0.05, n.s. otherwise (two-sided Wilcoxon rank-sum).</w:t>
+      </w:r>
+    </w:p>
+    <w:p>
+      <w:pPr>
+        <w:spacing w:after="120"/>
+      </w:pPr>
+      <w:r>
+        <w:t xml:space="preserve">Abbreviations. NMD, nonsense-mediated decay; PTC, premature termination codon; CDS, coding sequence; UTR, untranslated region.</w:t>
       </w:r>
     </w:p>
     <w:p>
@@ -917,59 +765,31 @@
         <w:spacing w:after="120"/>
       </w:pPr>
       <w:r>
-        <w:rPr>
-          <w:b/>
-          <w:bCs/>
-        </w:rPr>
-        <w:t xml:space="preserve">(A, D) Open-reading-frame length.</w:t>
-      </w:r>
-      <w:r>
-        <w:t xml:space="preserve"> Distribution of open-reading-frame length under the TransDecoder2-chosen start codon (blue) versus under the reference start codon projected onto the same transcript (coral). The TransDecoder2-selected open reading frame is ~5× longer than the reference-anchored open reading frame on the broad cohort (Panel A; medians 2,758 vs 588 nt) and ~8× longer on the occult-PTC subset (Panel D; medians 2,934 vs 380 nt). TransDecoder2 systematically picks longer reading frames that bypass the premature stop.</w:t>
-      </w:r>
-    </w:p>
-    <w:p>
-      <w:pPr>
-        <w:spacing w:after="120"/>
-      </w:pPr>
-      <w:r>
-        <w:rPr>
-          <w:b/>
-          <w:bCs/>
-        </w:rPr>
-        <w:t xml:space="preserve">(B, E) Kozak context.</w:t>
-      </w:r>
-      <w:r>
-        <w:t xml:space="preserve"> Paired Kozak position-weight-matrix scores at the reference start codon versus at the TransDecoder2 start codon, scored on the NMD-susceptible isoform. The reference start codon has systematically stronger Kozak context than the TransDecoder2 pick on both the broad cohort (Panel B; paired Wilcoxon p = 1.2 × 10⁻³⁸; medians 0.86 vs 0.29; reference stronger in 446 of 1,166 pairs) and the occult-PTC subset (Panel E; p = 2.6 × 10⁻³⁸; medians 1.04 vs −0.35; reference stronger in 384 of 492 pairs, i.e., 78 % of pairs follow the bias direction).</w:t>
-      </w:r>
-    </w:p>
-    <w:p>
-      <w:pPr>
-        <w:spacing w:after="120"/>
-      </w:pPr>
-      <w:r>
-        <w:rPr>
-          <w:b/>
-          <w:bCs/>
-        </w:rPr>
-        <w:t xml:space="preserve">(C, F) Position of the TransDecoder2 start codon relative to the reference.</w:t>
-      </w:r>
-      <w:r>
-        <w:t xml:space="preserve"> Position in transcript coordinates with the reference start codon at 0 (red dashed line). On the broad cohort (Panel C) a large spike at 0 reflects the 50 % of pairs in which TransDecoder2 chose the same start codon as the reference; 43 % of pairs (496 / 1,166) have the TransDecoder2 start downstream (median offset +471 nt) and 8 % (92 / 1,166) have it upstream. On the occult-PTC subset (Panel F) the spike at 0 disappears: 99 % (487 / 492) of TransDecoder2 starts are downstream of the reference (median offset +476 nt); only 1 % (5 / 492) are upstream. The contrast between the two rows shows that TransDecoder2's start-codon disagreement with the reference is most extreme — and almost always in the downstream, premature-termination-codon-avoiding direction — in exactly the population where the bias is biologically engaged.</w:t>
-      </w:r>
-    </w:p>
-    <w:p>
-      <w:pPr>
-        <w:spacing w:after="120"/>
-      </w:pPr>
-      <w:r>
-        <w:rPr>
-          <w:b/>
-          <w:bCs/>
-        </w:rPr>
-        <w:t xml:space="preserve">Abbreviations.</w:t>
-      </w:r>
-      <w:r>
-        <w:t xml:space="preserve"> NMD, nonsense-mediated decay; PTC, premature termination codon; PWM, position weight matrix.</w:t>
+        <w:t xml:space="preserve">(A, D) Open-reading-frame length. Distribution of open-reading-frame length under the TransDecoder2-chosen start codon (blue) versus under the reference start codon projected onto the same transcript (coral). The TransDecoder2-selected open reading frame is ~5× longer than the reference-anchored open reading frame on the broad cohort (Panel A; medians 2,758 vs 588 nt) and ~8× longer on the occult-PTC subset (Panel D; medians 2,934 vs 380 nt). TransDecoder2 systematically picks longer reading frames that bypass the premature stop.</w:t>
+      </w:r>
+    </w:p>
+    <w:p>
+      <w:pPr>
+        <w:spacing w:after="120"/>
+      </w:pPr>
+      <w:r>
+        <w:t xml:space="preserve">(B, E) Kozak context. Paired Kozak position-weight-matrix scores at the reference start codon versus at the TransDecoder2 start codon, scored on the NMD-susceptible isoform. The reference start codon has systematically stronger Kozak context than the TransDecoder2 pick on both the broad cohort (Panel B; paired Wilcoxon p = 1.2 × 10⁻³⁸; medians 0.86 vs 0.29; reference stronger in 446 of 1,166 pairs) and the occult-PTC subset (Panel E; p = 2.6 × 10⁻³⁸; medians 1.04 vs −0.35; reference stronger in 384 of 492 pairs, i.e., 78 % of pairs follow the bias direction).</w:t>
+      </w:r>
+    </w:p>
+    <w:p>
+      <w:pPr>
+        <w:spacing w:after="120"/>
+      </w:pPr>
+      <w:r>
+        <w:t xml:space="preserve">(C, F) Position of the TransDecoder2 start codon relative to the reference. Position in transcript coordinates with the reference start codon at 0 (red dashed line). On the broad cohort (Panel C) a large spike at 0 reflects the 50 % of pairs in which TransDecoder2 chose the same start codon as the reference; 43 % of pairs (496 / 1,166) have the TransDecoder2 start downstream (median offset +471 nt) and 8 % (92 / 1,166) have it upstream. On the occult-PTC subset (Panel F) the spike at 0 disappears: 99 % (487 / 492) of TransDecoder2 starts are downstream of the reference (median offset +476 nt); only 1 % (5 / 492) are upstream. The contrast between the two rows shows that TransDecoder2's start-codon disagreement with the reference is most extreme — and almost always in the downstream, premature-termination-codon-avoiding direction — in exactly the population where the bias is biologically engaged.</w:t>
+      </w:r>
+    </w:p>
+    <w:p>
+      <w:pPr>
+        <w:spacing w:after="120"/>
+      </w:pPr>
+      <w:r>
+        <w:t xml:space="preserve">Abbreviations. NMD, nonsense-mediated decay; PTC, premature termination codon; PWM, position weight matrix.</w:t>
       </w:r>
     </w:p>
     <w:p>
@@ -1035,27 +855,7 @@
         <w:t xml:space="preserve">SF36 | Total |SHAP| Across the AUG and Stop-Codon Windows. </w:t>
       </w:r>
       <w:r>
-        <w:t xml:space="preserve">Per-position |SHAP| summed across the nine input channels of the deep-learning model, comparing NMD susceptible (orange) and Control (blue) transcripts on the held-out test set (NMD n = 2,268, Control n = 7,863). Each transcript's AUG and stop windows are centred on its main open reading frame's start and stop codons. Main open reading frames are chosen with the following priority: the annotated reference CDS (projected from the gene's dominant non-NMD isoform) when available; otherwise the TransDecoder2-called CDS; otherwise the highest-Kozak-scoring open reading frame (see Methods, Main open reading frame selection). Values are smoothed with an 11-nt rolling mean over the raw per-position |SHAP| to abstract over trinucleotide-frame periodicity. </w:t>
-      </w:r>
-      <w:r>
-        <w:rPr>
-          <w:b/>
-          <w:bCs/>
-        </w:rPr>
-        <w:t xml:space="preserve">A)</w:t>
-      </w:r>
-      <w:r>
-        <w:t xml:space="preserve"> AUG window covering positions –250 to +249 relative to the start codon. </w:t>
-      </w:r>
-      <w:r>
-        <w:rPr>
-          <w:b/>
-          <w:bCs/>
-        </w:rPr>
-        <w:t xml:space="preserve">B)</w:t>
-      </w:r>
-      <w:r>
-        <w:t xml:space="preserve"> Stop-codon window covering the same relative range around the stop codon. Pooled across 5 DeepSHAP runs (500 background samples each).</w:t>
+        <w:t xml:space="preserve">Per-position |SHAP| summed across the nine input channels of the deep-learning model, comparing NMD susceptible (orange) and Control (blue) transcripts on the held-out test set (NMD n = 2,268, Control n = 7,863). Each transcript's AUG and stop windows are centred on its main open reading frame's start and stop codons. Main open reading frames are chosen with the following priority: the annotated reference CDS (projected from the gene's dominant non-NMD isoform) when available; otherwise the TransDecoder2-called CDS; otherwise the highest-Kozak-scoring open reading frame (see Methods, Main open reading frame selection). Values are smoothed with an 11-nt rolling mean over the raw per-position |SHAP| to abstract over trinucleotide-frame periodicity. A) AUG window covering positions –250 to +249 relative to the start codon. B) Stop-codon window covering the same relative range around the stop codon. Pooled across 5 DeepSHAP runs (500 background samples each).</w:t>
       </w:r>
     </w:p>
     <w:p>
@@ -1129,14 +929,7 @@
         <w:spacing w:after="120"/>
       </w:pPr>
       <w:r>
-        <w:rPr>
-          <w:b/>
-          <w:bCs/>
-        </w:rPr>
-        <w:t xml:space="preserve">Abbreviations.</w:t>
-      </w:r>
-      <w:r>
-        <w:t xml:space="preserve"> NMD, nonsense-mediated decay; UGA / UAA / UAG, the three canonical stop codons in RNA notation.</w:t>
+        <w:t xml:space="preserve">Abbreviations. NMD, nonsense-mediated decay; UGA / UAA / UAG, the three canonical stop codons in RNA notation.</w:t>
       </w:r>
     </w:p>
     <w:p>
@@ -1210,44 +1003,23 @@
         <w:spacing w:after="120"/>
       </w:pPr>
       <w:r>
-        <w:rPr>
-          <w:b/>
-          <w:bCs/>
-        </w:rPr>
-        <w:t xml:space="preserve">(A)</w:t>
-      </w:r>
-      <w:r>
-        <w:t xml:space="preserve"> Attention weight per candidate open reading frame rank, by class (NMD susceptible in coral, non-NMD in blue). Most attention concentrates at the rank-0 open reading frame in both classes (median ~0.74–0.76). The median rank-0 attention is slightly lower in NMD, with a corresponding shift of attention onto ranks 1–4 and a long tail of NMD isoforms placing more than 25 % of attention on a non-rank-0 candidate.</w:t>
-      </w:r>
-    </w:p>
-    <w:p>
-      <w:pPr>
-        <w:spacing w:after="120"/>
-      </w:pPr>
-      <w:r>
-        <w:rPr>
-          <w:b/>
-          <w:bCs/>
-        </w:rPr>
-        <w:t xml:space="preserve">(B)</w:t>
-      </w:r>
-      <w:r>
-        <w:t xml:space="preserve"> Shannon entropy of the per-isoform attention vector across the five candidate open reading frames (higher entropy, more broadly distributed attention). The NMD density is shifted toward higher entropy than the Control density, quantifying the broader spread shown in Panel A.</w:t>
-      </w:r>
-    </w:p>
-    <w:p>
-      <w:pPr>
-        <w:spacing w:after="120"/>
-      </w:pPr>
-      <w:r>
-        <w:rPr>
-          <w:b/>
-          <w:bCs/>
-        </w:rPr>
-        <w:t xml:space="preserve">Abbreviations.</w:t>
-      </w:r>
-      <w:r>
-        <w:t xml:space="preserve"> NMD, nonsense-mediated decay.</w:t>
+        <w:t xml:space="preserve">(A) Attention weight per candidate open reading frame rank, by class (NMD susceptible in coral, non-NMD in blue). Most attention concentrates at the rank-0 open reading frame in both classes (median ~0.74–0.76). The median rank-0 attention is slightly lower in NMD, with a corresponding shift of attention onto ranks 1–4 and a long tail of NMD isoforms placing more than 25 % of attention on a non-rank-0 candidate.</w:t>
+      </w:r>
+    </w:p>
+    <w:p>
+      <w:pPr>
+        <w:spacing w:after="120"/>
+      </w:pPr>
+      <w:r>
+        <w:t xml:space="preserve">(B) Shannon entropy of the per-isoform attention vector across the five candidate open reading frames (higher entropy, more broadly distributed attention). The NMD density is shifted toward higher entropy than the Control density, quantifying the broader spread shown in Panel A.</w:t>
+      </w:r>
+    </w:p>
+    <w:p>
+      <w:pPr>
+        <w:spacing w:after="120"/>
+      </w:pPr>
+      <w:r>
+        <w:t xml:space="preserve">Abbreviations. NMD, nonsense-mediated decay.</w:t>
       </w:r>
     </w:p>
     <w:p>
@@ -1329,54 +1101,23 @@
         <w:spacing w:after="120"/>
       </w:pPr>
       <w:r>
-        <w:rPr>
-          <w:b/>
-          <w:bCs/>
-        </w:rPr>
-        <w:t xml:space="preserve">(A) NMD susceptible with a premature termination codon (NMD+/PTC+).</w:t>
-      </w:r>
-      <w:r>
-        <w:t xml:space="preserve"> Structural features dominate (62 % of total branch attribution); the stop-codon window contributes 29 %; the start-codon window contributes 9 %. This pattern mirrors the pooled attribution shown in Figure 5 Panel C — when a premature termination codon is present, the structural and stop-codon features carry the prediction.</w:t>
-      </w:r>
-    </w:p>
-    <w:p>
-      <w:pPr>
-        <w:spacing w:after="120"/>
-      </w:pPr>
-      <w:r>
-        <w:rPr>
-          <w:b/>
-          <w:bCs/>
-        </w:rPr>
-        <w:t xml:space="preserve">(B) NMD susceptible without a premature termination codon (NMD+/PTC−).</w:t>
-      </w:r>
-      <w:r>
-        <w:t xml:space="preserve"> The structural share drops to 53 % (no premature termination codon means no excess downstream-junction signal); the stop share is essentially unchanged at 29 %; </w:t>
-      </w:r>
-      <w:r>
-        <w:rPr>
-          <w:b/>
-          <w:bCs/>
-        </w:rPr>
-        <w:t xml:space="preserve">the start-codon-window share doubles to 18 %</w:t>
-      </w:r>
-      <w:r>
-        <w:t xml:space="preserve">. The model relies more heavily on start-codon context to call NMD in these isoforms.</w:t>
-      </w:r>
-    </w:p>
-    <w:p>
-      <w:pPr>
-        <w:spacing w:after="120"/>
-      </w:pPr>
-      <w:r>
-        <w:rPr>
-          <w:b/>
-          <w:bCs/>
-        </w:rPr>
-        <w:t xml:space="preserve">(C) Non-NMD Controls.</w:t>
-      </w:r>
-      <w:r>
-        <w:t xml:space="preserve"> The proportional profile resembles NMD+/PTC+ (62 % / 27 % / 11 %) but at lower absolute magnitude across all three branches.</w:t>
+        <w:t xml:space="preserve">(A) NMD susceptible with a premature termination codon (NMD+/PTC+). Structural features dominate (62 % of total branch attribution); the stop-codon window contributes 29 %; the start-codon window contributes 9 %. This pattern mirrors the pooled attribution shown in Figure 5 Panel C — when a premature termination codon is present, the structural and stop-codon features carry the prediction.</w:t>
+      </w:r>
+    </w:p>
+    <w:p>
+      <w:pPr>
+        <w:spacing w:after="120"/>
+      </w:pPr>
+      <w:r>
+        <w:t xml:space="preserve">(B) NMD susceptible without a premature termination codon (NMD+/PTC−). The structural share drops to 53 % (no premature termination codon means no excess downstream-junction signal); the stop share is essentially unchanged at 29 %; the start-codon-window share doubles to 18 %. The model relies more heavily on start-codon context to call NMD in these isoforms.</w:t>
+      </w:r>
+    </w:p>
+    <w:p>
+      <w:pPr>
+        <w:spacing w:after="120"/>
+      </w:pPr>
+      <w:r>
+        <w:t xml:space="preserve">(C) Non-NMD Controls. The proportional profile resembles NMD+/PTC+ (62 % / 27 % / 11 %) but at lower absolute magnitude across all three branches.</w:t>
       </w:r>
     </w:p>
     <w:p>
@@ -1392,14 +1133,7 @@
         <w:spacing w:after="120"/>
       </w:pPr>
       <w:r>
-        <w:rPr>
-          <w:b/>
-          <w:bCs/>
-        </w:rPr>
-        <w:t xml:space="preserve">Abbreviations.</w:t>
-      </w:r>
-      <w:r>
-        <w:t xml:space="preserve"> NMD, nonsense-mediated decay; PTC, premature termination codon.</w:t>
+        <w:t xml:space="preserve">Abbreviations. NMD, nonsense-mediated decay; PTC, premature termination codon.</w:t>
       </w:r>
     </w:p>
     <w:p>
@@ -1473,44 +1207,23 @@
         <w:spacing w:after="120"/>
       </w:pPr>
       <w:r>
-        <w:rPr>
-          <w:b/>
-          <w:bCs/>
-        </w:rPr>
-        <w:t xml:space="preserve">(A)</w:t>
-      </w:r>
-      <w:r>
-        <w:t xml:space="preserve"> Receiver-operating-characteristic curves for the two NMD-vs-Control contrasts, using the model's predicted NMD probability as the score. The NMD+/PTC+ vs Control contrast achieves AUC = 0.96 (AUPRC = 0.94). The NMD+/PTC− vs Control contrast achieves AUC = 0.74 (AUPRC = 0.26). Diagonal, chance. The substantial AUC drop indicates that NMD-susceptible isoforms without an annotated premature termination codon are intrinsically harder for the model to discriminate from non-NMD isoforms — consistent with the loss of structural and stop-window signal shown in SF39.</w:t>
-      </w:r>
-    </w:p>
-    <w:p>
-      <w:pPr>
-        <w:spacing w:after="120"/>
-      </w:pPr>
-      <w:r>
-        <w:rPr>
-          <w:b/>
-          <w:bCs/>
-        </w:rPr>
-        <w:t xml:space="preserve">(B)</w:t>
-      </w:r>
-      <w:r>
-        <w:t xml:space="preserve"> Distribution of the per-isoform predicted NMD probability by subclass. NMD+/PTC+ isoforms cluster at high probability (mean = 0.85), comfortably above the 0.5 decision threshold; non-NMD Controls cluster at low probability (mean = 0.19); NMD+/PTC− isoforms straddle the threshold (mean = 0.39), placing many of them on the Control side of the decision boundary. Boxplots show median, IQR, and 1.5×IQR whiskers; the dashed horizontal line marks the 0.5 default decision threshold.</w:t>
-      </w:r>
-    </w:p>
-    <w:p>
-      <w:pPr>
-        <w:spacing w:after="120"/>
-      </w:pPr>
-      <w:r>
-        <w:rPr>
-          <w:b/>
-          <w:bCs/>
-        </w:rPr>
-        <w:t xml:space="preserve">Abbreviations.</w:t>
-      </w:r>
-      <w:r>
-        <w:t xml:space="preserve"> AUC, area under the receiver-operating-characteristic curve; AUPRC, area under the precision–recall curve; NMD, nonsense-mediated decay; PTC, premature termination codon; IQR, interquartile range.</w:t>
+        <w:t xml:space="preserve">(A) Receiver-operating-characteristic curves for the two NMD-vs-Control contrasts, using the model's predicted NMD probability as the score. The NMD+/PTC+ vs Control contrast achieves AUC = 0.96 (AUPRC = 0.94). The NMD+/PTC− vs Control contrast achieves AUC = 0.74 (AUPRC = 0.26). Diagonal, chance. The substantial AUC drop indicates that NMD-susceptible isoforms without an annotated premature termination codon are intrinsically harder for the model to discriminate from non-NMD isoforms — consistent with the loss of structural and stop-window signal shown in SF39.</w:t>
+      </w:r>
+    </w:p>
+    <w:p>
+      <w:pPr>
+        <w:spacing w:after="120"/>
+      </w:pPr>
+      <w:r>
+        <w:t xml:space="preserve">(B) Distribution of the per-isoform predicted NMD probability by subclass. NMD+/PTC+ isoforms cluster at high probability (mean = 0.85), comfortably above the 0.5 decision threshold; non-NMD Controls cluster at low probability (mean = 0.19); NMD+/PTC− isoforms straddle the threshold (mean = 0.39), placing many of them on the Control side of the decision boundary. Boxplots show median, IQR, and 1.5×IQR whiskers; the dashed horizontal line marks the 0.5 default decision threshold.</w:t>
+      </w:r>
+    </w:p>
+    <w:p>
+      <w:pPr>
+        <w:spacing w:after="120"/>
+      </w:pPr>
+      <w:r>
+        <w:t xml:space="preserve">Abbreviations. AUC, area under the receiver-operating-characteristic curve; AUPRC, area under the precision–recall curve; NMD, nonsense-mediated decay; PTC, premature termination codon; IQR, interquartile range.</w:t>
       </w:r>
     </w:p>
     <w:p>
@@ -1576,27 +1289,7 @@
         <w:t xml:space="preserve">SF41 | Rolling GC Content Across the AUG and Stop-Codon Windows. </w:t>
       </w:r>
       <w:r>
-        <w:t xml:space="preserve">Mean rolling GC content per position of the transcript sequences supplied to the deep-learning model, comparing NMD susceptible (orange) and Control (blue) transcripts on the held-out test set. Each transcript's window is centred on its main open reading frame's start or stop codon. Main open reading frames are chosen with the following priority: the annotated reference CDS (projected from the gene's dominant non-NMD isoform) when available; otherwise the TransDecoder2-called CDS; otherwise the highest-Kozak-scoring open reading frame (see Methods, Main open reading frame selection). NMD susceptible transcripts are restricted here to those whose main open reading frame is the annotated reference CDS (n = 1,743 of 2,268 NMD test transcripts, 76.9%), so that position 0 is the reference stop codon rather than a downstream TransDecoder2 stop codon; Control transcripts are unrestricted (n = 7,863). GC content is computed in a 50-nt sliding window with a 10-nt step from the model's one-hot nucleotide input channels; shading, ± 1 standard error of the mean. </w:t>
-      </w:r>
-      <w:r>
-        <w:rPr>
-          <w:b/>
-          <w:bCs/>
-        </w:rPr>
-        <w:t xml:space="preserve">A)</w:t>
-      </w:r>
-      <w:r>
-        <w:t xml:space="preserve"> AUG window. </w:t>
-      </w:r>
-      <w:r>
-        <w:rPr>
-          <w:b/>
-          <w:bCs/>
-        </w:rPr>
-        <w:t xml:space="preserve">B)</w:t>
-      </w:r>
-      <w:r>
-        <w:t xml:space="preserve"> Stop codon window.</w:t>
+        <w:t xml:space="preserve">Mean rolling GC content per position of the transcript sequences supplied to the deep-learning model, comparing NMD susceptible (orange) and Control (blue) transcripts on the held-out test set. Each transcript's window is centred on its main open reading frame's start or stop codon. Main open reading frames are chosen with the following priority: the annotated reference CDS (projected from the gene's dominant non-NMD isoform) when available; otherwise the TransDecoder2-called CDS; otherwise the highest-Kozak-scoring open reading frame (see Methods, Main open reading frame selection). NMD susceptible transcripts are restricted here to those whose main open reading frame is the annotated reference CDS (n = 1,743 of 2,268 NMD test transcripts, 76.9%), so that position 0 is the reference stop codon rather than a downstream TransDecoder2 stop codon; Control transcripts are unrestricted (n = 7,863). GC content is computed in a 50-nt sliding window with a 10-nt step from the model's one-hot nucleotide input channels; shading, ± 1 standard error of the mean. A) AUG window. B) Stop codon window.</w:t>
       </w:r>
     </w:p>
     <w:p>
@@ -1662,62 +1355,31 @@
         <w:t xml:space="preserve">SF42 | Head-to-head correlation of three NMD predictors with the mashr gold standard, pooled and per PTC subclass. </w:t>
       </w:r>
       <w:r>
-        <w:t xml:space="preserve">Three NMD-prediction models are scored against the same continuous gold standard — the mashr posterior-mean log₂ fold-change of each transcript under SMG1 inhibition — on the held-out test set of long-read-observed transcripts (chromosomes 1, 3, 5, 7; n = 561 total: 255 NMD-susceptible with a premature termination codon (NMD+/PTC+), 30 NMD-susceptible without a premature termination codon (NMD+/PTC−), and 276 non-NMD Controls). The models compared are NMDetective-B (Lindeboom </w:t>
-      </w:r>
-      <w:r>
-        <w:rPr>
-          <w:i/>
-          <w:iCs/>
-        </w:rPr>
-        <w:t xml:space="preserve">et al.</w:t>
-      </w:r>
-      <w:r>
-        <w:t xml:space="preserve"> 2019), the NMDEP rule-tree baseline (Saadat &amp; Fellay 2025), and the deep-learning model developed here.</w:t>
-      </w:r>
-    </w:p>
-    <w:p>
-      <w:pPr>
-        <w:spacing w:after="120"/>
-      </w:pPr>
-      <w:r>
-        <w:rPr>
-          <w:b/>
-          <w:bCs/>
-        </w:rPr>
-        <w:t xml:space="preserve">(A)</w:t>
-      </w:r>
-      <w:r>
-        <w:t xml:space="preserve"> Predicted NMD score (x-axis) versus the gold-standard log fold-change (y-axis), one subpanel per model. Each point is one transcript, coloured by subclass. Pooled Spearman correlation is annotated. All three models reach a similar pooled correlation (0.76–0.77), driven by the easy separation of NMD-susceptible transcripts from Controls.</w:t>
-      </w:r>
-    </w:p>
-    <w:p>
-      <w:pPr>
-        <w:spacing w:after="120"/>
-      </w:pPr>
-      <w:r>
-        <w:rPr>
-          <w:b/>
-          <w:bCs/>
-        </w:rPr>
-        <w:t xml:space="preserve">(B)</w:t>
-      </w:r>
-      <w:r>
-        <w:t xml:space="preserve"> Within-subclass Spearman correlation per model — the same scoring restricted to one PTC subclass at a time, isolating each model's ability to rank-order NMD susceptibility among transcripts of the same class. The deep-learning model achieves Spearman 0.34 (PTC+), 0.51 (PTC−), and 0.23 (Control). The two rule-tree models achieve ≤0.22 within PTC+, ≤0.01 within Controls, and are anti-correlated with the gold standard within PTC− (Spearman −0.14), because every PTC− transcript is by definition not flagged as a premature stop by the rule cascade despite being a real NMD substrate.</w:t>
-      </w:r>
-    </w:p>
-    <w:p>
-      <w:pPr>
-        <w:spacing w:after="120"/>
-      </w:pPr>
-      <w:r>
-        <w:rPr>
-          <w:b/>
-          <w:bCs/>
-        </w:rPr>
-        <w:t xml:space="preserve">Abbreviations.</w:t>
-      </w:r>
-      <w:r>
-        <w:t xml:space="preserve"> mashr, multivariate adaptive shrinkage; NMD, nonsense-mediated decay; NMDEP, neural-network NMD efficacy predictor (Saadat &amp; Fellay 2025); PTC, premature termination codon; SMG1, suppressor of morphogenesis in genitalia-1 (the kinase whose inhibition stabilises NMD substrates).</w:t>
+        <w:t xml:space="preserve">Three NMD-prediction models are scored against the same continuous gold standard — the mashr posterior-mean log₂ fold-change of each transcript under SMG1 inhibition — on the held-out test set of long-read-observed transcripts (chromosomes 1, 3, 5, 7; n = 561 total: 255 NMD-susceptible with a premature termination codon (NMD+/PTC+), 30 NMD-susceptible without a premature termination codon (NMD+/PTC−), and 276 non-NMD Controls). The models compared are NMDetective-B (Lindeboom et al. 2019), the NMDEP rule-tree baseline (Saadat &amp; Fellay 2025), and the deep-learning model developed here.</w:t>
+      </w:r>
+    </w:p>
+    <w:p>
+      <w:pPr>
+        <w:spacing w:after="120"/>
+      </w:pPr>
+      <w:r>
+        <w:t xml:space="preserve">(A) Predicted NMD score (x-axis) versus the gold-standard log fold-change (y-axis), one subpanel per model. Each point is one transcript, coloured by subclass. Pooled Spearman correlation is annotated. All three models reach a similar pooled correlation (0.76–0.77), driven by the easy separation of NMD-susceptible transcripts from Controls.</w:t>
+      </w:r>
+    </w:p>
+    <w:p>
+      <w:pPr>
+        <w:spacing w:after="120"/>
+      </w:pPr>
+      <w:r>
+        <w:t xml:space="preserve">(B) Within-subclass Spearman correlation per model — the same scoring restricted to one PTC subclass at a time, isolating each model's ability to rank-order NMD susceptibility among transcripts of the same class. The deep-learning model achieves Spearman 0.34 (PTC+), 0.51 (PTC−), and 0.23 (Control). The two rule-tree models achieve ≤0.22 within PTC+, ≤0.01 within Controls, and are anti-correlated with the gold standard within PTC− (Spearman −0.14), because every PTC− transcript is by definition not flagged as a premature stop by the rule cascade despite being a real NMD substrate.</w:t>
+      </w:r>
+    </w:p>
+    <w:p>
+      <w:pPr>
+        <w:spacing w:after="120"/>
+      </w:pPr>
+      <w:r>
+        <w:t xml:space="preserve">Abbreviations. mashr, multivariate adaptive shrinkage; NMD, nonsense-mediated decay; NMDEP, neural-network NMD efficacy predictor (Saadat &amp; Fellay 2025); PTC, premature termination codon; SMG1, suppressor of morphogenesis in genitalia-1 (the kinase whose inhibition stabilises NMD substrates).</w:t>
       </w:r>
     </w:p>
     <w:sectPr>

</xml_diff>

<commit_message>
Rebuild SF24-42 supplemental figures docx + PDF (4-CT + legend QA)
The compiled document was stale (built 14:59, before the legend QA). Rebuilt
via build_supplemental_figures_docx.js + LibreOffice PDF export so it embeds:
the 4-CT figures, NMD-susceptible->NMD susceptible captions, EJC Abbreviations
(SF30/31), 4-level significance-star keys (SF29/32/35 re-rendered), and the
SF28 flowchart with the reference-share floor-drop annotation.

Co-Authored-By: Claude Opus 4.8 <noreply@anthropic.com>
</commit_message>
<xml_diff>
--- a/paper/nmd_supplemental_figures_sf24_sf42.docx
+++ b/paper/nmd_supplemental_figures_sf24_sf42.docx
@@ -73,7 +73,7 @@
         <w:t xml:space="preserve">SF24 | Twelve Isopair Splice Event Categories. </w:t>
       </w:r>
       <w:r>
-        <w:t xml:space="preserve">Schematic of the twelve splice-event types identified when comparing a paired isoform (Comparator, bottom track) to the gene's dominant non-NMD isoform (Reference, top track). Grey boxes, exons; horizontal lines with chevrons, introns (chevrons point in the direction of transcription, 5′ → 3′). Categories: transcript-end variants (Alt TSS, Alt TES); alternative splice sites (A5SS, A3SS); exon skipping (Skipped Exon, Missing Internal); and intron retention in six forms (Partial IR 5′, Partial IR 3′, Full IR, IR diff 5′, IR diff 3′, IR diff 5′ + 3′).</w:t>
+        <w:t xml:space="preserve">Schematic of the twelve splice-event types identified when comparing a paired isoform (Comparator, bottom track) to the gene's dominant non-NMD isoform (Reference, top track). Gray boxes, exons; horizontal lines with chevrons, introns (chevrons point in the direction of transcription, 5′ → 3′). Categories: transcript-end variants (Alt TSS, Alt TES); alternative splice sites (A5SS, A3SS); exon skipping (Skipped Exon, Missing Internal); and intron retention in six forms (Partial IR 5′, Partial IR 3′, Full IR, IR diff 5′, IR diff 3′, IR diff 5′ + 3′).</w:t>
       </w:r>
     </w:p>
     <w:p>
@@ -139,7 +139,7 @@
         <w:t xml:space="preserve">SF25 | Isoforms per Gene in Isopair Analysis. </w:t>
       </w:r>
       <w:r>
-        <w:t xml:space="preserve">Distribution of the number of expressed isoforms per gene across the 1,585 genes for which gene-matched NMD-susceptible / reference / non-NMD isoform triplets could be constructed. The median gene contributes 7 isoforms (dashed line). Counts include all long-read isoforms passing the expression filter in at least one of the four cell types (AT2, LAE, FB, MV) under DMSO.</w:t>
+        <w:t xml:space="preserve">Distribution of the number of expressed isoforms per gene across the 1,548 genes for which gene-matched NMD susceptible / reference / non-NMD isoform triplets could be constructed. The median gene contributes 6 isoforms (dashed line). Counts include all long-read isoforms passing the expression filter in at least one of the four cell types (AT2, LAE, FB, MV) under DMSO.</w:t>
       </w:r>
     </w:p>
     <w:p>
@@ -205,7 +205,7 @@
         <w:t xml:space="preserve">SF26 | Reference Share of Gene Expression. </w:t>
       </w:r>
       <w:r>
-        <w:t xml:space="preserve">Distribution across 1,585 genes (each contributing a gene-matched NMD-susceptible / reference / non-NMD isoform triplet) of the reference isoform's mean DMSO expression as a fraction of the gene's total isoform expression. Reference isoforms are the highest-expressed strictly-non-NMD isoform per gene in DMSO (mean across all sequenced libraries). Dashed line, median; solid line, 25% retention floor.</w:t>
+        <w:t xml:space="preserve">Distribution across 1,548 genes (each contributing a gene-matched NMD susceptible / reference / non-NMD isoform triplet) of the reference isoform's mean DMSO expression as a fraction of the gene's total isoform expression. Reference isoforms are the highest-expressed strictly-non-NMD isoform per gene in DMSO (mean across the four cell types). Dashed line, median; solid line, 25% retention floor.</w:t>
       </w:r>
     </w:p>
     <w:p>
@@ -271,23 +271,23 @@
         <w:t xml:space="preserve">SF27 | Transcript Length by Isopair Analysis Category. </w:t>
       </w:r>
       <w:r>
-        <w:t xml:space="preserve">Violin plot of transcript length (log10 nt) for the 1,585 gene-matched isoform triplets: NMD comparator (orange), Reference (grey), Control comparator (blue). Reference is the highest-expressed non-NMD isoform per gene under DMSO across the four cell types (AT2, LAE, FB, MV); the NMD and Control comparators are the paired NMD-susceptible and non-NMD non-reference isoforms from the same gene. Solid black bar, median. Abbreviations. nt, nucleotides.</w:t>
-      </w:r>
-    </w:p>
-    <w:p>
-      <w:pPr>
-        <w:spacing w:after="240"/>
-      </w:pPr>
-    </w:p>
-    <w:p>
-      <w:pPr>
-        <w:spacing w:after="60" w:before="120"/>
-        <w:jc w:val="center"/>
-      </w:pPr>
-      <w:r>
-        <w:drawing>
-          <wp:inline distT="0" distB="0" distL="0" distR="0">
-            <wp:extent cx="5943600" cy="6248400"/>
+        <w:t xml:space="preserve">Violin plot of transcript length (log10 nt) for the 1,548 gene-matched isoform triplets: NMD comparator (orange), Reference (gray), Control comparator (blue). Reference is the highest-expressed non-NMD isoform per gene under DMSO across the four cell types (AT2, LAE, FB, MV); the NMD and Control comparators are the paired NMD susceptible and non-NMD non-reference isoforms from the same gene. Solid black bar, median. Abbreviations. nt, nucleotides.</w:t>
+      </w:r>
+    </w:p>
+    <w:p>
+      <w:pPr>
+        <w:spacing w:after="240"/>
+      </w:pPr>
+    </w:p>
+    <w:p>
+      <w:pPr>
+        <w:spacing w:after="60" w:before="120"/>
+        <w:jc w:val="center"/>
+      </w:pPr>
+      <w:r>
+        <w:drawing>
+          <wp:inline distT="0" distB="0" distL="0" distR="0">
+            <wp:extent cx="5943600" cy="6381750"/>
             <wp:effectExtent t="0" r="0" b="0" l="0"/>
             <wp:docPr id="1" name="SF28_PairAnalysisFlowchart" descr="SF28 | Isopair Analysis Flowchart." title="SF28 | Isopair Analysis Flowchart."/>
             <wp:cNvGraphicFramePr>
@@ -312,7 +312,7 @@
                   <pic:spPr bwMode="auto">
                     <a:xfrm>
                       <a:off x="0" y="0"/>
-                      <a:ext cx="5943600" cy="6248400"/>
+                      <a:ext cx="5943600" cy="6381750"/>
                     </a:xfrm>
                     <a:prstGeom prst="rect">
                       <a:avLst/>
@@ -403,7 +403,30 @@
         <w:t xml:space="preserve">SF29 | Gain Direction by Splice Event Type. </w:t>
       </w:r>
       <w:r>
-        <w:t xml:space="preserve">Percentage of detected splice events (across 1,585 gene-matched isoform triplets, both NMD and Control comparators) in which the comparator has additional sequence relative to its reference isoform (Gain direction). One bar-pair per event type — NMD comparators (orange) vs Control comparators (blue) — sorted by NMD-side %Gain, descending. Dashed line, 50% (no directional preference). Direction is defined from the comparator's perspective (see SF24 for event-type definitions). Significance stars, Fisher's exact test on the 2 × 2 (Gain/Loss × NMD/Control) count table per event type.</w:t>
+        <w:t xml:space="preserve">Percentage of detected splice events (across 1,548 gene-matched isoform triplets, both NMD and Control comparators) in which the comparator has additional sequence relative to its reference isoform (Gain direction). One bar-pair per event type — NMD comparators (orange) vs Control comparators (blue) — sorted by NMD-side %Gain, descending. Dashed line, 50% (no directional preference). Direction is defined from the comparator's perspective (see SF24 for event-type definitions). Significance stars, Fisher's exact test on the 2 × 2 (Gain/Loss × NMD/Control) count table per event type: </w:t>
+      </w:r>
+      <w:r>
+        <w:rPr>
+          <w:b/>
+          <w:bCs/>
+        </w:rPr>
+        <w:t xml:space="preserve"/>
+      </w:r>
+      <w:r>
+        <w:t xml:space="preserve">p &lt; 10⁻¹⁰, </w:t>
+      </w:r>
+      <w:r>
+        <w:rPr>
+          <w:b/>
+          <w:bCs/>
+        </w:rPr>
+        <w:t xml:space="preserve">*p &lt; 10⁻⁴, </w:t>
+      </w:r>
+      <w:r>
+        <w:t xml:space="preserve">p &lt; 10⁻³, </w:t>
+      </w:r>
+      <w:r>
+        <w:t xml:space="preserve">*p &lt; 0.05; n.s. otherwise.</w:t>
       </w:r>
     </w:p>
     <w:p>
@@ -469,7 +492,7 @@
         <w:t xml:space="preserve">SF30 | NMD-Response Magnitude vs Stop Codon Distance to Last EJC. </w:t>
       </w:r>
       <w:r>
-        <w:t xml:space="preserve">Per-comparator NMD-response magnitude (mashr posterior-mean log₂ fold-change under SMG1 inhibition, averaged across AT2, LAE, FB and MV) plotted against the distance from the comparator's stop codon to the transcript's last exon-junction complex. Positive values, stop codon upstream of the last EJC (candidate NMD substrate); negative values, stop codon downstream of the last EJC. Grey points, individual comparators (1st–99th percentile of x-axis shown); orange line, local-linear smoother; orange band, bootstrap 95% CI. Dashed red line, the operational 50-nt PTC threshold. Population: n = 888 comparators (all of Subset 2, gene-matched reference AUG-traceable). Stop anchor: reference AUG-traced (the first in-frame stop reached after projecting the reference gene's AUG onto the comparator); this avoids the attenuation that would arise from TD2 anchoring on non-PTC main ORFs. Median log₂ fold-change is 2.19 above the 50-nt threshold and 1.07 at or below it (Wilcoxon one-sided p = 7.4 × 10⁻¹⁶). Abbreviations. nt, nucleotides; ORF, open reading frame.</w:t>
+        <w:t xml:space="preserve">Per-comparator NMD-response magnitude (mashr posterior-mean log₂ fold-change under SMG1 inhibition, averaged across AT2, LAE, FB and MV) plotted against the distance from the comparator's stop codon to the transcript's last EJC. Positive values, stop codon upstream of the last EJC (candidate NMD substrate); negative values, stop codon downstream of the last EJC. Gray points, individual comparators (1st–99th percentile of x-axis shown); orange line, local-linear smoother; orange band, bootstrap 95% CI. Dashed red line, the operational 50-nt PTC threshold. Population: n = 819 comparators (all of Subset 2, gene-matched reference AUG-traceable). Stop anchor: reference AUG-traced (the first in-frame stop reached after projecting the reference gene's AUG onto the comparator); this avoids the attenuation that would arise from TD2 anchoring on non-PTC main ORFs. Median log₂ fold-change is 2.19 above the 50-nt threshold and 1.08 at or below it (Wilcoxon one-sided p = 3.7 × 10⁻¹³). Abbreviations. EJC, exon junction complex; nt, nucleotides; ORF, open reading frame.</w:t>
       </w:r>
     </w:p>
     <w:p>
@@ -535,7 +558,7 @@
         <w:t xml:space="preserve">SF31 | NMD Effect Size by Downstream EJC Count in PTC-Positive NMD Comparators. </w:t>
       </w:r>
       <w:r>
-        <w:t xml:space="preserve">Distribution of NMD-response magnitude (mashr posterior-mean log₂ fold-change under SMG1 inhibition, averaged across AT2, LAE, FB and MV) as a function of the number of exon-junction complexes downstream of the comparator's stop codon. Restricted to comparators with at least one downstream EJC (n = 818), drawn from the same Subset 2 population as SF30. Downstream-EJC counts of 7 or more are collapsed into a single "7+" bin. Violin, kernel density; overlaid box, interquartile range and median; red line, per-bin median trend. Per-bin sample counts are shown above each violin. Stop anchor: reference AUG-traced, matching SF30.</w:t>
+        <w:t xml:space="preserve">Distribution of NMD-response magnitude (mashr posterior-mean log₂ fold-change under SMG1 inhibition, averaged across AT2, LAE, FB and MV) as a function of the number of EJCs downstream of the comparator's stop codon. Restricted to comparators with at least one downstream EJC (n = 756), drawn from the same Subset 2 population as SF30. Downstream-EJC counts of 7 or more are collapsed into a single "7+" bin. Violin, kernel density; overlaid box, interquartile range and median; red line, per-bin median trend. Per-bin sample counts are shown above each violin. Stop anchor: reference AUG-traced, matching SF30. Abbreviations. EJC, exon junction complex; PTC, premature termination codon; nt, nucleotides.</w:t>
       </w:r>
     </w:p>
     <w:p>
@@ -601,13 +624,34 @@
         <w:t xml:space="preserve">SF32 | CDS and 3′UTR Length Across Isoform Classes in the GENCODE-Restricted Isoform Pairs Subset. </w:t>
       </w:r>
       <w:r>
-        <w:t xml:space="preserve">Restricted to triplets in which all three transcripts are annotated coding transcripts (n = 54 NMD+/PTC+, 82 NMD+/PTC−, 136 Control). Stop anchor: each isoform's own annotated CDS. (A) CDS length; (B) 3′UTR length from the annotated stop to transcript end; (C) 3′UTR length after walking past any premature stop to the first non-premature stop (Panel C NMD+/PTC+ n = 50; 4 comparators lack a downstream non-premature stop and are dropped). Solid black bar inside each violin, median. Two-sided Wilcoxon rank-sum: </w:t>
-      </w:r>
-      <w:r>
-        <w:t xml:space="preserve">*</w:t>
-      </w:r>
-      <w:r>
-        <w:t xml:space="preserve">p &lt; 0.05, </w:t>
+        <w:t xml:space="preserve">Restricted to triplets in which all three transcripts are annotated coding transcripts (n = 48 NMD+/PTC+, 82 NMD+/PTC−, 130 Control). Stop anchor: each isoform's own annotated CDS. (A) CDS length; (B) 3′UTR length from the annotated stop to transcript end; (C) 3′UTR length after walking past any premature stop to the first non-premature stop (Panel C NMD+/PTC+ n = 45; 3 comparators lack a downstream non-premature stop and are dropped). Solid black bar inside each violin, median. Two-sided Wilcoxon rank-sum: </w:t>
+      </w:r>
+      <w:r>
+        <w:t xml:space="preserve">*</w:t>
+      </w:r>
+      <w:r>
+        <w:t xml:space="preserve">*</w:t>
+      </w:r>
+      <w:r>
+        <w:t xml:space="preserve">*</w:t>
+      </w:r>
+      <w:r>
+        <w:t xml:space="preserve">*</w:t>
+      </w:r>
+      <w:r>
+        <w:t xml:space="preserve">p &lt; 10⁻¹⁰, </w:t>
+      </w:r>
+      <w:r>
+        <w:t xml:space="preserve">*</w:t>
+      </w:r>
+      <w:r>
+        <w:t xml:space="preserve">*</w:t>
+      </w:r>
+      <w:r>
+        <w:t xml:space="preserve">*</w:t>
+      </w:r>
+      <w:r>
+        <w:t xml:space="preserve">p &lt; 10⁻⁴, </w:t>
       </w:r>
       <w:r>
         <w:t xml:space="preserve">*</w:t>
@@ -622,13 +666,7 @@
         <w:t xml:space="preserve">*</w:t>
       </w:r>
       <w:r>
-        <w:t xml:space="preserve">*</w:t>
-      </w:r>
-      <w:r>
-        <w:t xml:space="preserve">*</w:t>
-      </w:r>
-      <w:r>
-        <w:t xml:space="preserve">p &lt; 10⁻⁴; n.s. otherwise. Abbreviations. CDS, coding sequence; PTC, premature termination codon.</w:t>
+        <w:t xml:space="preserve">p &lt; 0.05; n.s. otherwise. Abbreviations. CDS, coding sequence; PTC, premature termination codon.</w:t>
       </w:r>
     </w:p>
     <w:p>
@@ -694,7 +732,7 @@
         <w:t xml:space="preserve">SF33 | TD2 Versus Reference AUG-Traced ORFs, Reference AUG-Traceable Cohort. </w:t>
       </w:r>
       <w:r>
-        <w:t xml:space="preserve">n = 888 gene-matched NMD comparator pairs. (A) ORF-length distribution under the TD2 call versus under the reference AUG projected onto the same transcript. (B) Paired Kozak PWM score at the reference AUG versus at the TD2-predicted start codon. (C) Position of the TD2 AUG relative to the reference AUG (0 = same site). Solid black bar inside each violin, median. Abbreviations. ORF, open reading frame; PWM, position weight matrix; TD2, TransDecoder2.</w:t>
+        <w:t xml:space="preserve">n = 819 gene-matched NMD comparator pairs. (A) ORF-length distribution under the TD2 call versus under the reference AUG projected onto the same transcript. (B) Paired Kozak PWM score at the reference AUG versus at the TD2-predicted start codon. (C) Position of the TD2 AUG relative to the reference AUG (0 = same site). Solid black bar inside each violin, median. Abbreviations. ORF, open reading frame; PWM, position weight matrix; TD2, TransDecoder2.</w:t>
       </w:r>
     </w:p>
     <w:p>
@@ -760,7 +798,7 @@
         <w:t xml:space="preserve">SF34 | TD2 Versus Reference AUG-Traced ORFs, Occult-PTC Subset. </w:t>
       </w:r>
       <w:r>
-        <w:t xml:space="preserve">Restricted to the n = 380 comparators in which projecting the reference AUG revealed a PTC that the TD2 CDS call did not. Panels A–C match SF33. Abbreviations. CDS, coding sequence; ORF, open reading frame; PTC, premature termination codon; TD2, TransDecoder2.</w:t>
+        <w:t xml:space="preserve">Restricted to the n = 348 comparators in which projecting the reference AUG revealed a PTC that the TD2 CDS call did not. Panels A–C match SF33. Abbreviations. CDS, coding sequence; ORF, open reading frame; PTC, premature termination codon; TD2, TransDecoder2.</w:t>
       </w:r>
     </w:p>
     <w:p>
@@ -826,13 +864,34 @@
         <w:t xml:space="preserve">SF35 | CDS and 3′UTR Length Across Isoform Classes, Reference AUG-Traceable Cohort. </w:t>
       </w:r>
       <w:r>
-        <w:t xml:space="preserve">Restricted to gene-matched pairs in which the reference AUG projects onto the comparator transcript (n = 818 NMD+/PTC+, 70 NMD+/PTC−, 888 Control). Stop anchor: the reference gene's AUG projected onto the comparator, which is unbiased with respect to TD2's PTC-avoidance (see SF33). Panels A–C match SF32. Solid black bar inside each violin, median. (Panel C NMD+/PTC+ n = 812 and Control n = 886; comparators without a downstream non-premature stop are dropped.) Two-sided Wilcoxon rank-sum: </w:t>
-      </w:r>
-      <w:r>
-        <w:t xml:space="preserve">*</w:t>
-      </w:r>
-      <w:r>
-        <w:t xml:space="preserve">p &lt; 0.05, </w:t>
+        <w:t xml:space="preserve">Restricted to gene-matched pairs in which the reference AUG projects onto the comparator transcript (n = 756 NMD+/PTC+, 63 NMD+/PTC−, 819 Control). Stop anchor: the reference gene's AUG projected onto the comparator, which is unbiased with respect to TD2's PTC-avoidance (see SF33). Panels A–C match SF32. Solid black bar inside each violin, median. (Panel C NMD+/PTC+ n = 751; comparators without a downstream non-premature stop are dropped.) Two-sided Wilcoxon rank-sum: </w:t>
+      </w:r>
+      <w:r>
+        <w:t xml:space="preserve">*</w:t>
+      </w:r>
+      <w:r>
+        <w:t xml:space="preserve">*</w:t>
+      </w:r>
+      <w:r>
+        <w:t xml:space="preserve">*</w:t>
+      </w:r>
+      <w:r>
+        <w:t xml:space="preserve">*</w:t>
+      </w:r>
+      <w:r>
+        <w:t xml:space="preserve">p &lt; 10⁻¹⁰, </w:t>
+      </w:r>
+      <w:r>
+        <w:t xml:space="preserve">*</w:t>
+      </w:r>
+      <w:r>
+        <w:t xml:space="preserve">*</w:t>
+      </w:r>
+      <w:r>
+        <w:t xml:space="preserve">*</w:t>
+      </w:r>
+      <w:r>
+        <w:t xml:space="preserve">p &lt; 10⁻⁴, </w:t>
       </w:r>
       <w:r>
         <w:t xml:space="preserve">*</w:t>
@@ -847,13 +906,7 @@
         <w:t xml:space="preserve">*</w:t>
       </w:r>
       <w:r>
-        <w:t xml:space="preserve">*</w:t>
-      </w:r>
-      <w:r>
-        <w:t xml:space="preserve">*</w:t>
-      </w:r>
-      <w:r>
-        <w:t xml:space="preserve">p &lt; 10⁻⁴; n.s. otherwise. Abbreviations. CDS, coding sequence; PTC, premature termination codon; TD2, TransDecoder2.</w:t>
+        <w:t xml:space="preserve">p &lt; 0.05; n.s. otherwise. Abbreviations. CDS, coding sequence; PTC, premature termination codon; TD2, TransDecoder2.</w:t>
       </w:r>
     </w:p>
     <w:p>
@@ -1117,7 +1170,7 @@
         <w:t xml:space="preserve">SF39 | Branch-Level Shapley Attributions of the Deep-Learning Model, Stratified by Isoform PTC Subclass. </w:t>
       </w:r>
       <w:r>
-        <w:t xml:space="preserve">Attributions of the model's NMD prediction across the three input branches (start codon window, stop codon window, structural features), computed for every isoform in each subclass. Subclasses: NMD+/PTC+ (n = 794), NMD+/PTC− (n = 60), Control (n = 851). Interpretability is computed on all reference AUG-traceable isoforms (not restricted to the held-out test set), so subgroup sample sizes are larger than in SF40, which reports discrimination on the held-out test subset only. (A) NMD+/PTC+. (B) NMD+/PTC−. (C) Control. Within each panel, bars are ordered structural / stop / start; the value in each bar is the mean absolute Shapley attribution at that branch; the percentage above each bar is that branch's share of the subclass total. Abbreviations. PTC, premature termination codon.</w:t>
+        <w:t xml:space="preserve">Attributions of the model's NMD prediction across the three input branches (start codon window, stop codon window, structural features), computed for every isoform in each subclass. Subclasses: NMD+/PTC+ (n = 735), NMD+/PTC− (n = 54), Control (n = 781). Interpretability is computed on all reference AUG-traceable isoforms (not restricted to the held-out test set), so subgroup sample sizes are larger than in SF40, which reports discrimination on the held-out test subset only. (A) NMD+/PTC+. (B) NMD+/PTC−. (C) Control. Within each panel, bars are ordered structural / stop / start; the value in each bar is the mean absolute Shapley attribution at that branch; the percentage above each bar is that branch's share of the subclass total. Abbreviations. PTC, premature termination codon.</w:t>
       </w:r>
     </w:p>
     <w:p>
@@ -1183,7 +1236,7 @@
         <w:t xml:space="preserve">SF40 | Deep-Learning Model Discrimination by PTC Subclass on the Held-Out Test Set. </w:t>
       </w:r>
       <w:r>
-        <w:t xml:space="preserve">Held-out test-set performance of the trained NMD predictor, stratified by the three subclasses: NMD+/PTC+ (n = 202), NMD+/PTC− (n = 20), and Control (n = 219). Subgroup sample sizes reflect held-out-test-set membership. (A) ROC curves for the two NMD-vs-Control contrasts, using the model's predicted NMD probability as the score; AUC annotated per contrast; diagonal, chance. (B) Distribution of per-isoform predicted NMD probability by subclass. Abbreviations. AUC, area under the ROC curve; PTC, premature termination codon; ROC, receiver-operating-characteristic.</w:t>
+        <w:t xml:space="preserve">Held-out test-set performance of the trained NMD predictor, stratified by the three subclasses: NMD+/PTC+ (n = 195), NMD+/PTC− (n = 16), and Control (n = 204). Subgroup sample sizes reflect held-out-test-set membership. (A) ROC curves for the two NMD-vs-Control contrasts, using the model's predicted NMD probability as the score; AUC annotated per contrast; diagonal, chance. (B) Distribution of per-isoform predicted NMD probability by subclass. Abbreviations. AUC, area under the ROC curve; PTC, premature termination codon; ROC, receiver-operating-characteristic.</w:t>
       </w:r>
     </w:p>
     <w:p>
@@ -1315,7 +1368,7 @@
         <w:t xml:space="preserve">SF42 | Head-to-Head Correlation of Three NMD Predictors With the mashr Gold Standard, Pooled and per PTC Subclass. </w:t>
       </w:r>
       <w:r>
-        <w:t xml:space="preserve">Predictors scored against the mashr posterior-mean log₂ fold-change under SMG1 inhibition on the held-out test set of long-read observed transcripts (chromosomes 1, 3, 5, 7; n = 561: NMD+/PTC+ 255, NMD+/PTC− 30, Control 276). Predictors: NMDetective-B (Lindeboom et al. 2019); NMDEP rule-tree baseline (Saadat &amp; Fellay 2025); the deep-learning model. (A) Predicted NMD score versus gold-standard log₂ fold-change, one subplot per model; points colored by subclass; pooled Spearman correlation annotated. (B) Within-subclass Spearman correlation per model. Abbreviations. mashr, multivariate adaptive shrinkage; NMDEP, NMD efficacy predictor; PTC, premature termination codon.</w:t>
+        <w:t xml:space="preserve">Predictors scored against the mashr posterior-mean log₂ fold-change under SMG1 inhibition on the held-out test set of long-read observed transcripts (chromosomes 1, 3, 5, 7; n = 415: NMD+/PTC+ 195, NMD+/PTC− 16, Control 204). Predictors: NMDetective-B (Lindeboom et al. 2019); NMDEP rule-tree baseline (Saadat &amp; Fellay 2025); the deep-learning model. (A) Predicted NMD score versus gold-standard log₂ fold-change, one subplot per model; points colored by subclass; pooled Spearman correlation annotated. (B) Within-subclass Spearman correlation per model. Abbreviations. mashr, multivariate adaptive shrinkage; NMDEP, NMD efficacy predictor; PTC, premature termination codon.</w:t>
       </w:r>
     </w:p>
     <w:sectPr>

</xml_diff>

<commit_message>
Fix SF29 significance-star key: escape asterisks for the docx markdown build
The SF29 star key had unescaped asterisks (****p<10^-10, ...), so the SF-docx
markdown parser ate them as bold/italic markers (rendered '**p < 10^-4**' bold,
leading stars dropped). Escaped them (\*) to match SF32/35 -> renders as literal
****/***/**/* stars. Rebuilt the SF24-42 docx + PDF.
(Fig 3/4/5 composite legends stay unescaped by design: they feed the manuscript
Google Doc as plain text, where literal '*' is correct.)

Co-Authored-By: Claude Opus 4.8 <noreply@anthropic.com>
</commit_message>
<xml_diff>
--- a/paper/nmd_supplemental_figures_sf24_sf42.docx
+++ b/paper/nmd_supplemental_figures_sf24_sf42.docx
@@ -406,27 +406,46 @@
         <w:t xml:space="preserve">Percentage of detected splice events (across 1,548 gene-matched isoform triplets, both NMD and Control comparators) in which the comparator has additional sequence relative to its reference isoform (Gain direction). One bar-pair per event type — NMD comparators (orange) vs Control comparators (blue) — sorted by NMD-side %Gain, descending. Dashed line, 50% (no directional preference). Direction is defined from the comparator's perspective (see SF24 for event-type definitions). Significance stars, Fisher's exact test on the 2 × 2 (Gain/Loss × NMD/Control) count table per event type: </w:t>
       </w:r>
       <w:r>
-        <w:rPr>
-          <w:b/>
-          <w:bCs/>
-        </w:rPr>
-        <w:t xml:space="preserve"/>
+        <w:t xml:space="preserve">*</w:t>
+      </w:r>
+      <w:r>
+        <w:t xml:space="preserve">*</w:t>
+      </w:r>
+      <w:r>
+        <w:t xml:space="preserve">*</w:t>
+      </w:r>
+      <w:r>
+        <w:t xml:space="preserve">*</w:t>
       </w:r>
       <w:r>
         <w:t xml:space="preserve">p &lt; 10⁻¹⁰, </w:t>
       </w:r>
       <w:r>
-        <w:rPr>
-          <w:b/>
-          <w:bCs/>
-        </w:rPr>
-        <w:t xml:space="preserve">*p &lt; 10⁻⁴, </w:t>
+        <w:t xml:space="preserve">*</w:t>
+      </w:r>
+      <w:r>
+        <w:t xml:space="preserve">*</w:t>
+      </w:r>
+      <w:r>
+        <w:t xml:space="preserve">*</w:t>
+      </w:r>
+      <w:r>
+        <w:t xml:space="preserve">p &lt; 10⁻⁴, </w:t>
+      </w:r>
+      <w:r>
+        <w:t xml:space="preserve">*</w:t>
+      </w:r>
+      <w:r>
+        <w:t xml:space="preserve">*</w:t>
       </w:r>
       <w:r>
         <w:t xml:space="preserve">p &lt; 10⁻³, </w:t>
       </w:r>
       <w:r>
-        <w:t xml:space="preserve">*p &lt; 0.05; n.s. otherwise.</w:t>
+        <w:t xml:space="preserve">*</w:t>
+      </w:r>
+      <w:r>
+        <w:t xml:space="preserve">p &lt; 0.05; n.s. otherwise.</w:t>
       </w:r>
     </w:p>
     <w:p>

</xml_diff>

<commit_message>
Legend star keys: order thresholds large-p -> small-p (start with *p<0.05)
Reorder every significance-star key from *p<0.05, **p<10⁻³, ***p<10⁻⁴, ****p<10⁻¹⁰
(n.s. last) per Pete's preference -- was ****-first. Applies to SF29/32/35 (escaped),
Fig3/4/5 composite legends (unescaped), and the canonical STARS_LEGEND in
figures/lib/p_to_stars.py; checklist example updated. Rebuilt SF docx + PDF.

Co-Authored-By: Claude Opus 4.8 <noreply@anthropic.com>
</commit_message>
<xml_diff>
--- a/paper/nmd_supplemental_figures_sf24_sf42.docx
+++ b/paper/nmd_supplemental_figures_sf24_sf42.docx
@@ -409,16 +409,16 @@
         <w:t xml:space="preserve">*</w:t>
       </w:r>
       <w:r>
-        <w:t xml:space="preserve">*</w:t>
-      </w:r>
-      <w:r>
-        <w:t xml:space="preserve">*</w:t>
-      </w:r>
-      <w:r>
-        <w:t xml:space="preserve">*</w:t>
-      </w:r>
-      <w:r>
-        <w:t xml:space="preserve">p &lt; 10⁻¹⁰, </w:t>
+        <w:t xml:space="preserve">p &lt; 0.05, </w:t>
+      </w:r>
+      <w:r>
+        <w:t xml:space="preserve">*</w:t>
+      </w:r>
+      <w:r>
+        <w:t xml:space="preserve">*</w:t>
+      </w:r>
+      <w:r>
+        <w:t xml:space="preserve">p &lt; 10⁻³, </w:t>
       </w:r>
       <w:r>
         <w:t xml:space="preserve">*</w:t>
@@ -439,145 +439,385 @@
         <w:t xml:space="preserve">*</w:t>
       </w:r>
       <w:r>
+        <w:t xml:space="preserve">*</w:t>
+      </w:r>
+      <w:r>
+        <w:t xml:space="preserve">*</w:t>
+      </w:r>
+      <w:r>
+        <w:t xml:space="preserve">p &lt; 10⁻¹⁰; n.s. otherwise.</w:t>
+      </w:r>
+    </w:p>
+    <w:p>
+      <w:pPr>
+        <w:spacing w:after="240"/>
+      </w:pPr>
+    </w:p>
+    <w:p>
+      <w:pPr>
+        <w:spacing w:after="60" w:before="120"/>
+        <w:jc w:val="center"/>
+      </w:pPr>
+      <w:r>
+        <w:drawing>
+          <wp:inline distT="0" distB="0" distL="0" distR="0">
+            <wp:extent cx="5943600" cy="3714750"/>
+            <wp:effectExtent t="0" r="0" b="0" l="0"/>
+            <wp:docPr id="1" name="SF30_PTCDistanceDoseResponse" descr="SF30 | NMD-Response Magnitude vs Stop Codon Distance to Last EJC." title="SF30 | NMD-Response Magnitude vs Stop Codon Distance to Last EJC."/>
+            <wp:cNvGraphicFramePr>
+              <a:graphicFrameLocks xmlns:a="http://schemas.openxmlformats.org/drawingml/2006/main" noChangeAspect="1"/>
+            </wp:cNvGraphicFramePr>
+            <a:graphic xmlns:a="http://schemas.openxmlformats.org/drawingml/2006/main">
+              <a:graphicData uri="http://schemas.openxmlformats.org/drawingml/2006/picture">
+                <pic:pic xmlns:pic="http://schemas.openxmlformats.org/drawingml/2006/picture">
+                  <pic:nvPicPr>
+                    <pic:cNvPr id="0" name="" descr=""/>
+                    <pic:cNvPicPr>
+                      <a:picLocks noChangeAspect="1" noChangeArrowheads="1"/>
+                    </pic:cNvPicPr>
+                  </pic:nvPicPr>
+                  <pic:blipFill>
+                    <a:blip r:embed="rId13" cstate="none"/>
+                    <a:srcRect/>
+                    <a:stretch>
+                      <a:fillRect/>
+                    </a:stretch>
+                  </pic:blipFill>
+                  <pic:spPr bwMode="auto">
+                    <a:xfrm>
+                      <a:off x="0" y="0"/>
+                      <a:ext cx="5943600" cy="3714750"/>
+                    </a:xfrm>
+                    <a:prstGeom prst="rect">
+                      <a:avLst/>
+                    </a:prstGeom>
+                  </pic:spPr>
+                </pic:pic>
+              </a:graphicData>
+            </a:graphic>
+          </wp:inline>
+        </w:drawing>
+      </w:r>
+    </w:p>
+    <w:p>
+      <w:pPr>
+        <w:spacing w:after="120"/>
+      </w:pPr>
+      <w:r>
+        <w:rPr>
+          <w:b/>
+          <w:bCs/>
+        </w:rPr>
+        <w:t xml:space="preserve">SF30 | NMD-Response Magnitude vs Stop Codon Distance to Last EJC. </w:t>
+      </w:r>
+      <w:r>
+        <w:t xml:space="preserve">Per-comparator NMD-response magnitude (mashr posterior-mean log₂ fold-change under SMG1 inhibition, averaged across AT2, LAE, FB and MV) plotted against the distance from the comparator's stop codon to the transcript's last EJC. Positive values, stop codon upstream of the last EJC (candidate NMD substrate); negative values, stop codon downstream of the last EJC. Gray points, individual comparators (1st–99th percentile of x-axis shown); orange line, local-linear smoother; orange band, bootstrap 95% CI. Dashed red line, the operational 50-nt PTC threshold. Population: n = 819 comparators (all of Subset 2, gene-matched reference AUG-traceable). Stop anchor: reference AUG-traced (the first in-frame stop reached after projecting the reference gene's AUG onto the comparator); this avoids the attenuation that would arise from TD2 anchoring on non-PTC main ORFs. Median log₂ fold-change is 2.19 above the 50-nt threshold and 1.08 at or below it (Wilcoxon one-sided p = 3.7 × 10⁻¹³). Abbreviations. EJC, exon junction complex; nt, nucleotides; ORF, open reading frame.</w:t>
+      </w:r>
+    </w:p>
+    <w:p>
+      <w:pPr>
+        <w:spacing w:after="240"/>
+      </w:pPr>
+    </w:p>
+    <w:p>
+      <w:pPr>
+        <w:spacing w:after="60" w:before="120"/>
+        <w:jc w:val="center"/>
+      </w:pPr>
+      <w:r>
+        <w:drawing>
+          <wp:inline distT="0" distB="0" distL="0" distR="0">
+            <wp:extent cx="5943600" cy="3305175"/>
+            <wp:effectExtent t="0" r="0" b="0" l="0"/>
+            <wp:docPr id="1" name="SF31_NMDEffectByEJCCount" descr="SF31 | NMD Effect Size by Downstream EJC Count in PTC-Positive NMD Comparators." title="SF31 | NMD Effect Size by Downstream EJC Count in PTC-Positive NMD Comparators."/>
+            <wp:cNvGraphicFramePr>
+              <a:graphicFrameLocks xmlns:a="http://schemas.openxmlformats.org/drawingml/2006/main" noChangeAspect="1"/>
+            </wp:cNvGraphicFramePr>
+            <a:graphic xmlns:a="http://schemas.openxmlformats.org/drawingml/2006/main">
+              <a:graphicData uri="http://schemas.openxmlformats.org/drawingml/2006/picture">
+                <pic:pic xmlns:pic="http://schemas.openxmlformats.org/drawingml/2006/picture">
+                  <pic:nvPicPr>
+                    <pic:cNvPr id="0" name="" descr=""/>
+                    <pic:cNvPicPr>
+                      <a:picLocks noChangeAspect="1" noChangeArrowheads="1"/>
+                    </pic:cNvPicPr>
+                  </pic:nvPicPr>
+                  <pic:blipFill>
+                    <a:blip r:embed="rId14" cstate="none"/>
+                    <a:srcRect/>
+                    <a:stretch>
+                      <a:fillRect/>
+                    </a:stretch>
+                  </pic:blipFill>
+                  <pic:spPr bwMode="auto">
+                    <a:xfrm>
+                      <a:off x="0" y="0"/>
+                      <a:ext cx="5943600" cy="3305175"/>
+                    </a:xfrm>
+                    <a:prstGeom prst="rect">
+                      <a:avLst/>
+                    </a:prstGeom>
+                  </pic:spPr>
+                </pic:pic>
+              </a:graphicData>
+            </a:graphic>
+          </wp:inline>
+        </w:drawing>
+      </w:r>
+    </w:p>
+    <w:p>
+      <w:pPr>
+        <w:spacing w:after="120"/>
+      </w:pPr>
+      <w:r>
+        <w:rPr>
+          <w:b/>
+          <w:bCs/>
+        </w:rPr>
+        <w:t xml:space="preserve">SF31 | NMD Effect Size by Downstream EJC Count in PTC-Positive NMD Comparators. </w:t>
+      </w:r>
+      <w:r>
+        <w:t xml:space="preserve">Distribution of NMD-response magnitude (mashr posterior-mean log₂ fold-change under SMG1 inhibition, averaged across AT2, LAE, FB and MV) as a function of the number of EJCs downstream of the comparator's stop codon. Restricted to comparators with at least one downstream EJC (n = 756), drawn from the same Subset 2 population as SF30. Downstream-EJC counts of 7 or more are collapsed into a single "7+" bin. Violin, kernel density; overlaid box, interquartile range and median; red line, per-bin median trend. Per-bin sample counts are shown above each violin. Stop anchor: reference AUG-traced, matching SF30. Abbreviations. EJC, exon junction complex; PTC, premature termination codon; nt, nucleotides.</w:t>
+      </w:r>
+    </w:p>
+    <w:p>
+      <w:pPr>
+        <w:spacing w:after="240"/>
+      </w:pPr>
+    </w:p>
+    <w:p>
+      <w:pPr>
+        <w:spacing w:after="60" w:before="120"/>
+        <w:jc w:val="center"/>
+      </w:pPr>
+      <w:r>
+        <w:drawing>
+          <wp:inline distT="0" distB="0" distL="0" distR="0">
+            <wp:extent cx="5943600" cy="5448300"/>
+            <wp:effectExtent t="0" r="0" b="0" l="0"/>
+            <wp:docPr id="1" name="SF32_CdsAnd3UTR_GENCODE" descr="SF32 | CDS and 3′UTR Length Across Isoform Classes in the GENCODE-Restricted Isoform Pairs Subset." title="SF32 | CDS and 3′UTR Length Across Isoform Classes in the GENCODE-Restricted Isoform Pairs Subset."/>
+            <wp:cNvGraphicFramePr>
+              <a:graphicFrameLocks xmlns:a="http://schemas.openxmlformats.org/drawingml/2006/main" noChangeAspect="1"/>
+            </wp:cNvGraphicFramePr>
+            <a:graphic xmlns:a="http://schemas.openxmlformats.org/drawingml/2006/main">
+              <a:graphicData uri="http://schemas.openxmlformats.org/drawingml/2006/picture">
+                <pic:pic xmlns:pic="http://schemas.openxmlformats.org/drawingml/2006/picture">
+                  <pic:nvPicPr>
+                    <pic:cNvPr id="0" name="" descr=""/>
+                    <pic:cNvPicPr>
+                      <a:picLocks noChangeAspect="1" noChangeArrowheads="1"/>
+                    </pic:cNvPicPr>
+                  </pic:nvPicPr>
+                  <pic:blipFill>
+                    <a:blip r:embed="rId15" cstate="none"/>
+                    <a:srcRect/>
+                    <a:stretch>
+                      <a:fillRect/>
+                    </a:stretch>
+                  </pic:blipFill>
+                  <pic:spPr bwMode="auto">
+                    <a:xfrm>
+                      <a:off x="0" y="0"/>
+                      <a:ext cx="5943600" cy="5448300"/>
+                    </a:xfrm>
+                    <a:prstGeom prst="rect">
+                      <a:avLst/>
+                    </a:prstGeom>
+                  </pic:spPr>
+                </pic:pic>
+              </a:graphicData>
+            </a:graphic>
+          </wp:inline>
+        </w:drawing>
+      </w:r>
+    </w:p>
+    <w:p>
+      <w:pPr>
+        <w:spacing w:after="120"/>
+      </w:pPr>
+      <w:r>
+        <w:rPr>
+          <w:b/>
+          <w:bCs/>
+        </w:rPr>
+        <w:t xml:space="preserve">SF32 | CDS and 3′UTR Length Across Isoform Classes in the GENCODE-Restricted Isoform Pairs Subset. </w:t>
+      </w:r>
+      <w:r>
+        <w:t xml:space="preserve">Restricted to triplets in which all three transcripts are annotated coding transcripts (n = 48 NMD+/PTC+, 82 NMD+/PTC−, 130 Control). Stop anchor: each isoform's own annotated CDS. (A) CDS length; (B) 3′UTR length from the annotated stop to transcript end; (C) 3′UTR length after walking past any premature stop to the first non-premature stop (Panel C NMD+/PTC+ n = 45; 3 comparators lack a downstream non-premature stop and are dropped). Solid black bar inside each violin, median. Two-sided Wilcoxon rank-sum: </w:t>
+      </w:r>
+      <w:r>
+        <w:t xml:space="preserve">*</w:t>
+      </w:r>
+      <w:r>
+        <w:t xml:space="preserve">p &lt; 0.05, </w:t>
+      </w:r>
+      <w:r>
+        <w:t xml:space="preserve">*</w:t>
+      </w:r>
+      <w:r>
+        <w:t xml:space="preserve">*</w:t>
+      </w:r>
+      <w:r>
         <w:t xml:space="preserve">p &lt; 10⁻³, </w:t>
       </w:r>
       <w:r>
         <w:t xml:space="preserve">*</w:t>
       </w:r>
       <w:r>
-        <w:t xml:space="preserve">p &lt; 0.05; n.s. otherwise.</w:t>
-      </w:r>
-    </w:p>
-    <w:p>
-      <w:pPr>
-        <w:spacing w:after="240"/>
-      </w:pPr>
-    </w:p>
-    <w:p>
-      <w:pPr>
-        <w:spacing w:after="60" w:before="120"/>
-        <w:jc w:val="center"/>
-      </w:pPr>
-      <w:r>
-        <w:drawing>
-          <wp:inline distT="0" distB="0" distL="0" distR="0">
-            <wp:extent cx="5943600" cy="3714750"/>
-            <wp:effectExtent t="0" r="0" b="0" l="0"/>
-            <wp:docPr id="1" name="SF30_PTCDistanceDoseResponse" descr="SF30 | NMD-Response Magnitude vs Stop Codon Distance to Last EJC." title="SF30 | NMD-Response Magnitude vs Stop Codon Distance to Last EJC."/>
-            <wp:cNvGraphicFramePr>
-              <a:graphicFrameLocks xmlns:a="http://schemas.openxmlformats.org/drawingml/2006/main" noChangeAspect="1"/>
-            </wp:cNvGraphicFramePr>
-            <a:graphic xmlns:a="http://schemas.openxmlformats.org/drawingml/2006/main">
-              <a:graphicData uri="http://schemas.openxmlformats.org/drawingml/2006/picture">
-                <pic:pic xmlns:pic="http://schemas.openxmlformats.org/drawingml/2006/picture">
-                  <pic:nvPicPr>
-                    <pic:cNvPr id="0" name="" descr=""/>
-                    <pic:cNvPicPr>
-                      <a:picLocks noChangeAspect="1" noChangeArrowheads="1"/>
-                    </pic:cNvPicPr>
-                  </pic:nvPicPr>
-                  <pic:blipFill>
-                    <a:blip r:embed="rId13" cstate="none"/>
-                    <a:srcRect/>
-                    <a:stretch>
-                      <a:fillRect/>
-                    </a:stretch>
-                  </pic:blipFill>
-                  <pic:spPr bwMode="auto">
-                    <a:xfrm>
-                      <a:off x="0" y="0"/>
-                      <a:ext cx="5943600" cy="3714750"/>
-                    </a:xfrm>
-                    <a:prstGeom prst="rect">
-                      <a:avLst/>
-                    </a:prstGeom>
-                  </pic:spPr>
-                </pic:pic>
-              </a:graphicData>
-            </a:graphic>
-          </wp:inline>
-        </w:drawing>
-      </w:r>
-    </w:p>
-    <w:p>
-      <w:pPr>
-        <w:spacing w:after="120"/>
-      </w:pPr>
-      <w:r>
-        <w:rPr>
-          <w:b/>
-          <w:bCs/>
-        </w:rPr>
-        <w:t xml:space="preserve">SF30 | NMD-Response Magnitude vs Stop Codon Distance to Last EJC. </w:t>
-      </w:r>
-      <w:r>
-        <w:t xml:space="preserve">Per-comparator NMD-response magnitude (mashr posterior-mean log₂ fold-change under SMG1 inhibition, averaged across AT2, LAE, FB and MV) plotted against the distance from the comparator's stop codon to the transcript's last EJC. Positive values, stop codon upstream of the last EJC (candidate NMD substrate); negative values, stop codon downstream of the last EJC. Gray points, individual comparators (1st–99th percentile of x-axis shown); orange line, local-linear smoother; orange band, bootstrap 95% CI. Dashed red line, the operational 50-nt PTC threshold. Population: n = 819 comparators (all of Subset 2, gene-matched reference AUG-traceable). Stop anchor: reference AUG-traced (the first in-frame stop reached after projecting the reference gene's AUG onto the comparator); this avoids the attenuation that would arise from TD2 anchoring on non-PTC main ORFs. Median log₂ fold-change is 2.19 above the 50-nt threshold and 1.08 at or below it (Wilcoxon one-sided p = 3.7 × 10⁻¹³). Abbreviations. EJC, exon junction complex; nt, nucleotides; ORF, open reading frame.</w:t>
-      </w:r>
-    </w:p>
-    <w:p>
-      <w:pPr>
-        <w:spacing w:after="240"/>
-      </w:pPr>
-    </w:p>
-    <w:p>
-      <w:pPr>
-        <w:spacing w:after="60" w:before="120"/>
-        <w:jc w:val="center"/>
-      </w:pPr>
-      <w:r>
-        <w:drawing>
-          <wp:inline distT="0" distB="0" distL="0" distR="0">
-            <wp:extent cx="5943600" cy="3305175"/>
-            <wp:effectExtent t="0" r="0" b="0" l="0"/>
-            <wp:docPr id="1" name="SF31_NMDEffectByEJCCount" descr="SF31 | NMD Effect Size by Downstream EJC Count in PTC-Positive NMD Comparators." title="SF31 | NMD Effect Size by Downstream EJC Count in PTC-Positive NMD Comparators."/>
-            <wp:cNvGraphicFramePr>
-              <a:graphicFrameLocks xmlns:a="http://schemas.openxmlformats.org/drawingml/2006/main" noChangeAspect="1"/>
-            </wp:cNvGraphicFramePr>
-            <a:graphic xmlns:a="http://schemas.openxmlformats.org/drawingml/2006/main">
-              <a:graphicData uri="http://schemas.openxmlformats.org/drawingml/2006/picture">
-                <pic:pic xmlns:pic="http://schemas.openxmlformats.org/drawingml/2006/picture">
-                  <pic:nvPicPr>
-                    <pic:cNvPr id="0" name="" descr=""/>
-                    <pic:cNvPicPr>
-                      <a:picLocks noChangeAspect="1" noChangeArrowheads="1"/>
-                    </pic:cNvPicPr>
-                  </pic:nvPicPr>
-                  <pic:blipFill>
-                    <a:blip r:embed="rId14" cstate="none"/>
-                    <a:srcRect/>
-                    <a:stretch>
-                      <a:fillRect/>
-                    </a:stretch>
-                  </pic:blipFill>
-                  <pic:spPr bwMode="auto">
-                    <a:xfrm>
-                      <a:off x="0" y="0"/>
-                      <a:ext cx="5943600" cy="3305175"/>
-                    </a:xfrm>
-                    <a:prstGeom prst="rect">
-                      <a:avLst/>
-                    </a:prstGeom>
-                  </pic:spPr>
-                </pic:pic>
-              </a:graphicData>
-            </a:graphic>
-          </wp:inline>
-        </w:drawing>
-      </w:r>
-    </w:p>
-    <w:p>
-      <w:pPr>
-        <w:spacing w:after="120"/>
-      </w:pPr>
-      <w:r>
-        <w:rPr>
-          <w:b/>
-          <w:bCs/>
-        </w:rPr>
-        <w:t xml:space="preserve">SF31 | NMD Effect Size by Downstream EJC Count in PTC-Positive NMD Comparators. </w:t>
-      </w:r>
-      <w:r>
-        <w:t xml:space="preserve">Distribution of NMD-response magnitude (mashr posterior-mean log₂ fold-change under SMG1 inhibition, averaged across AT2, LAE, FB and MV) as a function of the number of EJCs downstream of the comparator's stop codon. Restricted to comparators with at least one downstream EJC (n = 756), drawn from the same Subset 2 population as SF30. Downstream-EJC counts of 7 or more are collapsed into a single "7+" bin. Violin, kernel density; overlaid box, interquartile range and median; red line, per-bin median trend. Per-bin sample counts are shown above each violin. Stop anchor: reference AUG-traced, matching SF30. Abbreviations. EJC, exon junction complex; PTC, premature termination codon; nt, nucleotides.</w:t>
+        <w:t xml:space="preserve">*</w:t>
+      </w:r>
+      <w:r>
+        <w:t xml:space="preserve">*</w:t>
+      </w:r>
+      <w:r>
+        <w:t xml:space="preserve">p &lt; 10⁻⁴, </w:t>
+      </w:r>
+      <w:r>
+        <w:t xml:space="preserve">*</w:t>
+      </w:r>
+      <w:r>
+        <w:t xml:space="preserve">*</w:t>
+      </w:r>
+      <w:r>
+        <w:t xml:space="preserve">*</w:t>
+      </w:r>
+      <w:r>
+        <w:t xml:space="preserve">*</w:t>
+      </w:r>
+      <w:r>
+        <w:t xml:space="preserve">p &lt; 10⁻¹⁰; n.s. otherwise. Abbreviations. CDS, coding sequence; PTC, premature termination codon.</w:t>
+      </w:r>
+    </w:p>
+    <w:p>
+      <w:pPr>
+        <w:spacing w:after="240"/>
+      </w:pPr>
+    </w:p>
+    <w:p>
+      <w:pPr>
+        <w:spacing w:after="60" w:before="120"/>
+        <w:jc w:val="center"/>
+      </w:pPr>
+      <w:r>
+        <w:drawing>
+          <wp:inline distT="0" distB="0" distL="0" distR="0">
+            <wp:extent cx="5943600" cy="4867275"/>
+            <wp:effectExtent t="0" r="0" b="0" l="0"/>
+            <wp:docPr id="1" name="SF33_TD2Bias_broad" descr="SF33 | TD2 Versus Reference AUG-Traced ORFs, Reference AUG-Traceable Cohort." title="SF33 | TD2 Versus Reference AUG-Traced ORFs, Reference AUG-Traceable Cohort."/>
+            <wp:cNvGraphicFramePr>
+              <a:graphicFrameLocks xmlns:a="http://schemas.openxmlformats.org/drawingml/2006/main" noChangeAspect="1"/>
+            </wp:cNvGraphicFramePr>
+            <a:graphic xmlns:a="http://schemas.openxmlformats.org/drawingml/2006/main">
+              <a:graphicData uri="http://schemas.openxmlformats.org/drawingml/2006/picture">
+                <pic:pic xmlns:pic="http://schemas.openxmlformats.org/drawingml/2006/picture">
+                  <pic:nvPicPr>
+                    <pic:cNvPr id="0" name="" descr=""/>
+                    <pic:cNvPicPr>
+                      <a:picLocks noChangeAspect="1" noChangeArrowheads="1"/>
+                    </pic:cNvPicPr>
+                  </pic:nvPicPr>
+                  <pic:blipFill>
+                    <a:blip r:embed="rId16" cstate="none"/>
+                    <a:srcRect/>
+                    <a:stretch>
+                      <a:fillRect/>
+                    </a:stretch>
+                  </pic:blipFill>
+                  <pic:spPr bwMode="auto">
+                    <a:xfrm>
+                      <a:off x="0" y="0"/>
+                      <a:ext cx="5943600" cy="4867275"/>
+                    </a:xfrm>
+                    <a:prstGeom prst="rect">
+                      <a:avLst/>
+                    </a:prstGeom>
+                  </pic:spPr>
+                </pic:pic>
+              </a:graphicData>
+            </a:graphic>
+          </wp:inline>
+        </w:drawing>
+      </w:r>
+    </w:p>
+    <w:p>
+      <w:pPr>
+        <w:spacing w:after="120"/>
+      </w:pPr>
+      <w:r>
+        <w:rPr>
+          <w:b/>
+          <w:bCs/>
+        </w:rPr>
+        <w:t xml:space="preserve">SF33 | TD2 Versus Reference AUG-Traced ORFs, Reference AUG-Traceable Cohort. </w:t>
+      </w:r>
+      <w:r>
+        <w:t xml:space="preserve">n = 819 gene-matched NMD comparator pairs. (A) ORF-length distribution under the TD2 call versus under the reference AUG projected onto the same transcript. (B) Paired Kozak PWM score at the reference AUG versus at the TD2-predicted start codon. (C) Position of the TD2 AUG relative to the reference AUG (0 = same site). Solid black bar inside each violin, median. Abbreviations. ORF, open reading frame; PWM, position weight matrix; TD2, TransDecoder2.</w:t>
+      </w:r>
+    </w:p>
+    <w:p>
+      <w:pPr>
+        <w:spacing w:after="240"/>
+      </w:pPr>
+    </w:p>
+    <w:p>
+      <w:pPr>
+        <w:spacing w:after="60" w:before="120"/>
+        <w:jc w:val="center"/>
+      </w:pPr>
+      <w:r>
+        <w:drawing>
+          <wp:inline distT="0" distB="0" distL="0" distR="0">
+            <wp:extent cx="5943600" cy="4867275"/>
+            <wp:effectExtent t="0" r="0" b="0" l="0"/>
+            <wp:docPr id="1" name="SF34_TD2Bias_occult" descr="SF34 | TD2 Versus Reference AUG-Traced ORFs, Occult-PTC Subset." title="SF34 | TD2 Versus Reference AUG-Traced ORFs, Occult-PTC Subset."/>
+            <wp:cNvGraphicFramePr>
+              <a:graphicFrameLocks xmlns:a="http://schemas.openxmlformats.org/drawingml/2006/main" noChangeAspect="1"/>
+            </wp:cNvGraphicFramePr>
+            <a:graphic xmlns:a="http://schemas.openxmlformats.org/drawingml/2006/main">
+              <a:graphicData uri="http://schemas.openxmlformats.org/drawingml/2006/picture">
+                <pic:pic xmlns:pic="http://schemas.openxmlformats.org/drawingml/2006/picture">
+                  <pic:nvPicPr>
+                    <pic:cNvPr id="0" name="" descr=""/>
+                    <pic:cNvPicPr>
+                      <a:picLocks noChangeAspect="1" noChangeArrowheads="1"/>
+                    </pic:cNvPicPr>
+                  </pic:nvPicPr>
+                  <pic:blipFill>
+                    <a:blip r:embed="rId17" cstate="none"/>
+                    <a:srcRect/>
+                    <a:stretch>
+                      <a:fillRect/>
+                    </a:stretch>
+                  </pic:blipFill>
+                  <pic:spPr bwMode="auto">
+                    <a:xfrm>
+                      <a:off x="0" y="0"/>
+                      <a:ext cx="5943600" cy="4867275"/>
+                    </a:xfrm>
+                    <a:prstGeom prst="rect">
+                      <a:avLst/>
+                    </a:prstGeom>
+                  </pic:spPr>
+                </pic:pic>
+              </a:graphicData>
+            </a:graphic>
+          </wp:inline>
+        </w:drawing>
+      </w:r>
+    </w:p>
+    <w:p>
+      <w:pPr>
+        <w:spacing w:after="120"/>
+      </w:pPr>
+      <w:r>
+        <w:rPr>
+          <w:b/>
+          <w:bCs/>
+        </w:rPr>
+        <w:t xml:space="preserve">SF34 | TD2 Versus Reference AUG-Traced ORFs, Occult-PTC Subset. </w:t>
+      </w:r>
+      <w:r>
+        <w:t xml:space="preserve">Restricted to the n = 348 comparators in which projecting the reference AUG revealed a PTC that the TD2 CDS call did not. Panels A–C match SF33. Abbreviations. CDS, coding sequence; ORF, open reading frame; PTC, premature termination codon; TD2, TransDecoder2.</w:t>
       </w:r>
     </w:p>
     <w:p>
@@ -595,21 +835,21 @@
           <wp:inline distT="0" distB="0" distL="0" distR="0">
             <wp:extent cx="5943600" cy="5448300"/>
             <wp:effectExtent t="0" r="0" b="0" l="0"/>
-            <wp:docPr id="1" name="SF32_CdsAnd3UTR_GENCODE" descr="SF32 | CDS and 3′UTR Length Across Isoform Classes in the GENCODE-Restricted Isoform Pairs Subset." title="SF32 | CDS and 3′UTR Length Across Isoform Classes in the GENCODE-Restricted Isoform Pairs Subset."/>
-            <wp:cNvGraphicFramePr>
-              <a:graphicFrameLocks xmlns:a="http://schemas.openxmlformats.org/drawingml/2006/main" noChangeAspect="1"/>
-            </wp:cNvGraphicFramePr>
-            <a:graphic xmlns:a="http://schemas.openxmlformats.org/drawingml/2006/main">
-              <a:graphicData uri="http://schemas.openxmlformats.org/drawingml/2006/picture">
-                <pic:pic xmlns:pic="http://schemas.openxmlformats.org/drawingml/2006/picture">
-                  <pic:nvPicPr>
-                    <pic:cNvPr id="0" name="" descr=""/>
-                    <pic:cNvPicPr>
-                      <a:picLocks noChangeAspect="1" noChangeArrowheads="1"/>
-                    </pic:cNvPicPr>
-                  </pic:nvPicPr>
-                  <pic:blipFill>
-                    <a:blip r:embed="rId15" cstate="none"/>
+            <wp:docPr id="1" name="SF35_CdsAnd3UTR_refAUG" descr="SF35 | CDS and 3′UTR Length Across Isoform Classes, Reference AUG-Traceable Cohort." title="SF35 | CDS and 3′UTR Length Across Isoform Classes, Reference AUG-Traceable Cohort."/>
+            <wp:cNvGraphicFramePr>
+              <a:graphicFrameLocks xmlns:a="http://schemas.openxmlformats.org/drawingml/2006/main" noChangeAspect="1"/>
+            </wp:cNvGraphicFramePr>
+            <a:graphic xmlns:a="http://schemas.openxmlformats.org/drawingml/2006/main">
+              <a:graphicData uri="http://schemas.openxmlformats.org/drawingml/2006/picture">
+                <pic:pic xmlns:pic="http://schemas.openxmlformats.org/drawingml/2006/picture">
+                  <pic:nvPicPr>
+                    <pic:cNvPr id="0" name="" descr=""/>
+                    <pic:cNvPicPr>
+                      <a:picLocks noChangeAspect="1" noChangeArrowheads="1"/>
+                    </pic:cNvPicPr>
+                  </pic:nvPicPr>
+                  <pic:blipFill>
+                    <a:blip r:embed="rId18" cstate="none"/>
                     <a:srcRect/>
                     <a:stretch>
                       <a:fillRect/>
@@ -640,25 +880,25 @@
           <w:b/>
           <w:bCs/>
         </w:rPr>
-        <w:t xml:space="preserve">SF32 | CDS and 3′UTR Length Across Isoform Classes in the GENCODE-Restricted Isoform Pairs Subset. </w:t>
-      </w:r>
-      <w:r>
-        <w:t xml:space="preserve">Restricted to triplets in which all three transcripts are annotated coding transcripts (n = 48 NMD+/PTC+, 82 NMD+/PTC−, 130 Control). Stop anchor: each isoform's own annotated CDS. (A) CDS length; (B) 3′UTR length from the annotated stop to transcript end; (C) 3′UTR length after walking past any premature stop to the first non-premature stop (Panel C NMD+/PTC+ n = 45; 3 comparators lack a downstream non-premature stop and are dropped). Solid black bar inside each violin, median. Two-sided Wilcoxon rank-sum: </w:t>
-      </w:r>
-      <w:r>
-        <w:t xml:space="preserve">*</w:t>
-      </w:r>
-      <w:r>
-        <w:t xml:space="preserve">*</w:t>
-      </w:r>
-      <w:r>
-        <w:t xml:space="preserve">*</w:t>
-      </w:r>
-      <w:r>
-        <w:t xml:space="preserve">*</w:t>
-      </w:r>
-      <w:r>
-        <w:t xml:space="preserve">p &lt; 10⁻¹⁰, </w:t>
+        <w:t xml:space="preserve">SF35 | CDS and 3′UTR Length Across Isoform Classes, Reference AUG-Traceable Cohort. </w:t>
+      </w:r>
+      <w:r>
+        <w:t xml:space="preserve">Restricted to gene-matched pairs in which the reference AUG projects onto the comparator transcript (n = 756 NMD+/PTC+, 63 NMD+/PTC−, 819 Control). Stop anchor: the reference gene's AUG projected onto the comparator, which is unbiased with respect to TD2's PTC-avoidance (see SF33). Panels A–C match SF32. Solid black bar inside each violin, median. (Panel C NMD+/PTC+ n = 751; comparators without a downstream non-premature stop are dropped.) Two-sided Wilcoxon rank-sum: </w:t>
+      </w:r>
+      <w:r>
+        <w:t xml:space="preserve">*</w:t>
+      </w:r>
+      <w:r>
+        <w:t xml:space="preserve">p &lt; 0.05, </w:t>
+      </w:r>
+      <w:r>
+        <w:t xml:space="preserve">*</w:t>
+      </w:r>
+      <w:r>
+        <w:t xml:space="preserve">*</w:t>
+      </w:r>
+      <w:r>
+        <w:t xml:space="preserve">p &lt; 10⁻³, </w:t>
       </w:r>
       <w:r>
         <w:t xml:space="preserve">*</w:t>
@@ -679,253 +919,13 @@
         <w:t xml:space="preserve">*</w:t>
       </w:r>
       <w:r>
-        <w:t xml:space="preserve">p &lt; 10⁻³, </w:t>
-      </w:r>
-      <w:r>
-        <w:t xml:space="preserve">*</w:t>
-      </w:r>
-      <w:r>
-        <w:t xml:space="preserve">p &lt; 0.05; n.s. otherwise. Abbreviations. CDS, coding sequence; PTC, premature termination codon.</w:t>
-      </w:r>
-    </w:p>
-    <w:p>
-      <w:pPr>
-        <w:spacing w:after="240"/>
-      </w:pPr>
-    </w:p>
-    <w:p>
-      <w:pPr>
-        <w:spacing w:after="60" w:before="120"/>
-        <w:jc w:val="center"/>
-      </w:pPr>
-      <w:r>
-        <w:drawing>
-          <wp:inline distT="0" distB="0" distL="0" distR="0">
-            <wp:extent cx="5943600" cy="4867275"/>
-            <wp:effectExtent t="0" r="0" b="0" l="0"/>
-            <wp:docPr id="1" name="SF33_TD2Bias_broad" descr="SF33 | TD2 Versus Reference AUG-Traced ORFs, Reference AUG-Traceable Cohort." title="SF33 | TD2 Versus Reference AUG-Traced ORFs, Reference AUG-Traceable Cohort."/>
-            <wp:cNvGraphicFramePr>
-              <a:graphicFrameLocks xmlns:a="http://schemas.openxmlformats.org/drawingml/2006/main" noChangeAspect="1"/>
-            </wp:cNvGraphicFramePr>
-            <a:graphic xmlns:a="http://schemas.openxmlformats.org/drawingml/2006/main">
-              <a:graphicData uri="http://schemas.openxmlformats.org/drawingml/2006/picture">
-                <pic:pic xmlns:pic="http://schemas.openxmlformats.org/drawingml/2006/picture">
-                  <pic:nvPicPr>
-                    <pic:cNvPr id="0" name="" descr=""/>
-                    <pic:cNvPicPr>
-                      <a:picLocks noChangeAspect="1" noChangeArrowheads="1"/>
-                    </pic:cNvPicPr>
-                  </pic:nvPicPr>
-                  <pic:blipFill>
-                    <a:blip r:embed="rId16" cstate="none"/>
-                    <a:srcRect/>
-                    <a:stretch>
-                      <a:fillRect/>
-                    </a:stretch>
-                  </pic:blipFill>
-                  <pic:spPr bwMode="auto">
-                    <a:xfrm>
-                      <a:off x="0" y="0"/>
-                      <a:ext cx="5943600" cy="4867275"/>
-                    </a:xfrm>
-                    <a:prstGeom prst="rect">
-                      <a:avLst/>
-                    </a:prstGeom>
-                  </pic:spPr>
-                </pic:pic>
-              </a:graphicData>
-            </a:graphic>
-          </wp:inline>
-        </w:drawing>
-      </w:r>
-    </w:p>
-    <w:p>
-      <w:pPr>
-        <w:spacing w:after="120"/>
-      </w:pPr>
-      <w:r>
-        <w:rPr>
-          <w:b/>
-          <w:bCs/>
-        </w:rPr>
-        <w:t xml:space="preserve">SF33 | TD2 Versus Reference AUG-Traced ORFs, Reference AUG-Traceable Cohort. </w:t>
-      </w:r>
-      <w:r>
-        <w:t xml:space="preserve">n = 819 gene-matched NMD comparator pairs. (A) ORF-length distribution under the TD2 call versus under the reference AUG projected onto the same transcript. (B) Paired Kozak PWM score at the reference AUG versus at the TD2-predicted start codon. (C) Position of the TD2 AUG relative to the reference AUG (0 = same site). Solid black bar inside each violin, median. Abbreviations. ORF, open reading frame; PWM, position weight matrix; TD2, TransDecoder2.</w:t>
-      </w:r>
-    </w:p>
-    <w:p>
-      <w:pPr>
-        <w:spacing w:after="240"/>
-      </w:pPr>
-    </w:p>
-    <w:p>
-      <w:pPr>
-        <w:spacing w:after="60" w:before="120"/>
-        <w:jc w:val="center"/>
-      </w:pPr>
-      <w:r>
-        <w:drawing>
-          <wp:inline distT="0" distB="0" distL="0" distR="0">
-            <wp:extent cx="5943600" cy="4867275"/>
-            <wp:effectExtent t="0" r="0" b="0" l="0"/>
-            <wp:docPr id="1" name="SF34_TD2Bias_occult" descr="SF34 | TD2 Versus Reference AUG-Traced ORFs, Occult-PTC Subset." title="SF34 | TD2 Versus Reference AUG-Traced ORFs, Occult-PTC Subset."/>
-            <wp:cNvGraphicFramePr>
-              <a:graphicFrameLocks xmlns:a="http://schemas.openxmlformats.org/drawingml/2006/main" noChangeAspect="1"/>
-            </wp:cNvGraphicFramePr>
-            <a:graphic xmlns:a="http://schemas.openxmlformats.org/drawingml/2006/main">
-              <a:graphicData uri="http://schemas.openxmlformats.org/drawingml/2006/picture">
-                <pic:pic xmlns:pic="http://schemas.openxmlformats.org/drawingml/2006/picture">
-                  <pic:nvPicPr>
-                    <pic:cNvPr id="0" name="" descr=""/>
-                    <pic:cNvPicPr>
-                      <a:picLocks noChangeAspect="1" noChangeArrowheads="1"/>
-                    </pic:cNvPicPr>
-                  </pic:nvPicPr>
-                  <pic:blipFill>
-                    <a:blip r:embed="rId17" cstate="none"/>
-                    <a:srcRect/>
-                    <a:stretch>
-                      <a:fillRect/>
-                    </a:stretch>
-                  </pic:blipFill>
-                  <pic:spPr bwMode="auto">
-                    <a:xfrm>
-                      <a:off x="0" y="0"/>
-                      <a:ext cx="5943600" cy="4867275"/>
-                    </a:xfrm>
-                    <a:prstGeom prst="rect">
-                      <a:avLst/>
-                    </a:prstGeom>
-                  </pic:spPr>
-                </pic:pic>
-              </a:graphicData>
-            </a:graphic>
-          </wp:inline>
-        </w:drawing>
-      </w:r>
-    </w:p>
-    <w:p>
-      <w:pPr>
-        <w:spacing w:after="120"/>
-      </w:pPr>
-      <w:r>
-        <w:rPr>
-          <w:b/>
-          <w:bCs/>
-        </w:rPr>
-        <w:t xml:space="preserve">SF34 | TD2 Versus Reference AUG-Traced ORFs, Occult-PTC Subset. </w:t>
-      </w:r>
-      <w:r>
-        <w:t xml:space="preserve">Restricted to the n = 348 comparators in which projecting the reference AUG revealed a PTC that the TD2 CDS call did not. Panels A–C match SF33. Abbreviations. CDS, coding sequence; ORF, open reading frame; PTC, premature termination codon; TD2, TransDecoder2.</w:t>
-      </w:r>
-    </w:p>
-    <w:p>
-      <w:pPr>
-        <w:spacing w:after="240"/>
-      </w:pPr>
-    </w:p>
-    <w:p>
-      <w:pPr>
-        <w:spacing w:after="60" w:before="120"/>
-        <w:jc w:val="center"/>
-      </w:pPr>
-      <w:r>
-        <w:drawing>
-          <wp:inline distT="0" distB="0" distL="0" distR="0">
-            <wp:extent cx="5943600" cy="5448300"/>
-            <wp:effectExtent t="0" r="0" b="0" l="0"/>
-            <wp:docPr id="1" name="SF35_CdsAnd3UTR_refAUG" descr="SF35 | CDS and 3′UTR Length Across Isoform Classes, Reference AUG-Traceable Cohort." title="SF35 | CDS and 3′UTR Length Across Isoform Classes, Reference AUG-Traceable Cohort."/>
-            <wp:cNvGraphicFramePr>
-              <a:graphicFrameLocks xmlns:a="http://schemas.openxmlformats.org/drawingml/2006/main" noChangeAspect="1"/>
-            </wp:cNvGraphicFramePr>
-            <a:graphic xmlns:a="http://schemas.openxmlformats.org/drawingml/2006/main">
-              <a:graphicData uri="http://schemas.openxmlformats.org/drawingml/2006/picture">
-                <pic:pic xmlns:pic="http://schemas.openxmlformats.org/drawingml/2006/picture">
-                  <pic:nvPicPr>
-                    <pic:cNvPr id="0" name="" descr=""/>
-                    <pic:cNvPicPr>
-                      <a:picLocks noChangeAspect="1" noChangeArrowheads="1"/>
-                    </pic:cNvPicPr>
-                  </pic:nvPicPr>
-                  <pic:blipFill>
-                    <a:blip r:embed="rId18" cstate="none"/>
-                    <a:srcRect/>
-                    <a:stretch>
-                      <a:fillRect/>
-                    </a:stretch>
-                  </pic:blipFill>
-                  <pic:spPr bwMode="auto">
-                    <a:xfrm>
-                      <a:off x="0" y="0"/>
-                      <a:ext cx="5943600" cy="5448300"/>
-                    </a:xfrm>
-                    <a:prstGeom prst="rect">
-                      <a:avLst/>
-                    </a:prstGeom>
-                  </pic:spPr>
-                </pic:pic>
-              </a:graphicData>
-            </a:graphic>
-          </wp:inline>
-        </w:drawing>
-      </w:r>
-    </w:p>
-    <w:p>
-      <w:pPr>
-        <w:spacing w:after="120"/>
-      </w:pPr>
-      <w:r>
-        <w:rPr>
-          <w:b/>
-          <w:bCs/>
-        </w:rPr>
-        <w:t xml:space="preserve">SF35 | CDS and 3′UTR Length Across Isoform Classes, Reference AUG-Traceable Cohort. </w:t>
-      </w:r>
-      <w:r>
-        <w:t xml:space="preserve">Restricted to gene-matched pairs in which the reference AUG projects onto the comparator transcript (n = 756 NMD+/PTC+, 63 NMD+/PTC−, 819 Control). Stop anchor: the reference gene's AUG projected onto the comparator, which is unbiased with respect to TD2's PTC-avoidance (see SF33). Panels A–C match SF32. Solid black bar inside each violin, median. (Panel C NMD+/PTC+ n = 751; comparators without a downstream non-premature stop are dropped.) Two-sided Wilcoxon rank-sum: </w:t>
-      </w:r>
-      <w:r>
-        <w:t xml:space="preserve">*</w:t>
-      </w:r>
-      <w:r>
-        <w:t xml:space="preserve">*</w:t>
-      </w:r>
-      <w:r>
-        <w:t xml:space="preserve">*</w:t>
-      </w:r>
-      <w:r>
-        <w:t xml:space="preserve">*</w:t>
-      </w:r>
-      <w:r>
-        <w:t xml:space="preserve">p &lt; 10⁻¹⁰, </w:t>
-      </w:r>
-      <w:r>
-        <w:t xml:space="preserve">*</w:t>
-      </w:r>
-      <w:r>
-        <w:t xml:space="preserve">*</w:t>
-      </w:r>
-      <w:r>
-        <w:t xml:space="preserve">*</w:t>
-      </w:r>
-      <w:r>
-        <w:t xml:space="preserve">p &lt; 10⁻⁴, </w:t>
-      </w:r>
-      <w:r>
-        <w:t xml:space="preserve">*</w:t>
-      </w:r>
-      <w:r>
-        <w:t xml:space="preserve">*</w:t>
-      </w:r>
-      <w:r>
-        <w:t xml:space="preserve">p &lt; 10⁻³, </w:t>
-      </w:r>
-      <w:r>
-        <w:t xml:space="preserve">*</w:t>
-      </w:r>
-      <w:r>
-        <w:t xml:space="preserve">p &lt; 0.05; n.s. otherwise. Abbreviations. CDS, coding sequence; PTC, premature termination codon; TD2, TransDecoder2.</w:t>
+        <w:t xml:space="preserve">*</w:t>
+      </w:r>
+      <w:r>
+        <w:t xml:space="preserve">*</w:t>
+      </w:r>
+      <w:r>
+        <w:t xml:space="preserve">p &lt; 10⁻¹⁰; n.s. otherwise. Abbreviations. CDS, coding sequence; PTC, premature termination codon; TD2, TransDecoder2.</w:t>
       </w:r>
     </w:p>
     <w:p>

</xml_diff>

<commit_message>
SF legend/figure review fixes (SF24/29/32/33/34/35/36/39)
Per Pete's review of the SF legends vs figures:
- SF29: delete phantom '50% dashed line' clause; drop empty IR diff 5'+3'
  category (0 Control events); move legend to upper-right.
- SF24: add event abbreviation in parens after each full panel title.
- SF32/SF35: Panel B y-label 'translation' -> 'from annotated stop'.
- SF33/SF34: Panel A now uses Panel B colour regime (Reference=blue, TD2=salmon);
  drop unexplained Panel C median-offset dotted line; Panel B label
  'TD2-predicted AUG' -> 'TD2-predicted CDS'. SF34: add brief A/B/C descriptions.
- SF36: panel/title 'AUG window' -> 'Start window'.
- SF39: third branch bar label 'AUG' -> 'Start' (matches legend).
Rebuilt SF docx + PDF; linter clean.

Co-Authored-By: Claude Opus 4.8 <noreply@anthropic.com>
</commit_message>
<xml_diff>
--- a/paper/nmd_supplemental_figures_sf24_sf42.docx
+++ b/paper/nmd_supplemental_figures_sf24_sf42.docx
@@ -403,7 +403,7 @@
         <w:t xml:space="preserve">SF29 | Gain Direction by Splice Event Type. </w:t>
       </w:r>
       <w:r>
-        <w:t xml:space="preserve">Percentage of detected splice events (across 1,548 gene-matched isoform triplets, both NMD and Control comparators) in which the comparator has additional sequence relative to its reference isoform (Gain direction). One bar-pair per event type — NMD comparators (orange) vs Control comparators (blue) — sorted by NMD-side %Gain, descending. Dashed line, 50% (no directional preference). Direction is defined from the comparator's perspective (see SF24 for event-type definitions). Significance stars, Fisher's exact test on the 2 × 2 (Gain/Loss × NMD/Control) count table per event type: </w:t>
+        <w:t xml:space="preserve">Percentage of detected splice events (across 1,548 gene-matched isoform triplets, both NMD and Control comparators) in which the comparator has additional sequence relative to its reference isoform (Gain direction). One bar-pair per event type — NMD comparators (orange) vs Control comparators (blue) — sorted by NMD-side %Gain, descending. Direction is defined from the comparator's perspective (see SF24 for event-type definitions). Significance stars, Fisher's exact test on the 2 × 2 (Gain/Loss × NMD/Control) count table per event type: </w:t>
       </w:r>
       <w:r>
         <w:t xml:space="preserve">*</w:t>
@@ -817,7 +817,7 @@
         <w:t xml:space="preserve">SF34 | TD2 Versus Reference AUG-Traced ORFs, Occult-PTC Subset. </w:t>
       </w:r>
       <w:r>
-        <w:t xml:space="preserve">Restricted to the n = 348 comparators in which projecting the reference AUG revealed a PTC that the TD2 CDS call did not. Abbreviations. CDS, coding sequence; ORF, open reading frame; PTC, premature termination codon; TD2, TransDecoder2.</w:t>
+        <w:t xml:space="preserve">Restricted to the n = 348 comparators in which projecting the reference AUG revealed a PTC that the TD2 CDS call did not. (A) ORF-length distribution, TD2 call vs reference AUG projected onto the same transcript. (B) Paired Kozak PWM score at the reference AUG vs the TD2-predicted start codon. (C) Position of the TD2 start codon relative to the reference AUG (0 = same site). Abbreviations. CDS, coding sequence; ORF, open reading frame; PTC, premature termination codon; TD2, TransDecoder2.</w:t>
       </w:r>
     </w:p>
     <w:p>
@@ -943,7 +943,7 @@
           <wp:inline distT="0" distB="0" distL="0" distR="0">
             <wp:extent cx="5943600" cy="2476500"/>
             <wp:effectExtent t="0" r="0" b="0" l="0"/>
-            <wp:docPr id="1" name="SF36_ShapAcrossWindows" descr="SF36 | Total |SHAP| Across the AUG and Stop Codon Windows." title="SF36 | Total |SHAP| Across the AUG and Stop Codon Windows."/>
+            <wp:docPr id="1" name="SF36_ShapAcrossWindows" descr="SF36 | Total |SHAP| Across the Start and Stop Codon Windows." title="SF36 | Total |SHAP| Across the Start and Stop Codon Windows."/>
             <wp:cNvGraphicFramePr>
               <a:graphicFrameLocks xmlns:a="http://schemas.openxmlformats.org/drawingml/2006/main" noChangeAspect="1"/>
             </wp:cNvGraphicFramePr>
@@ -988,10 +988,10 @@
           <w:b/>
           <w:bCs/>
         </w:rPr>
-        <w:t xml:space="preserve">SF36 | Total |SHAP| Across the AUG and Stop Codon Windows. </w:t>
-      </w:r>
-      <w:r>
-        <w:t xml:space="preserve">Per-position |SHAP| summed across the nine input channels of the deep-learning model, comparing NMD susceptible (orange) and Control (blue) transcripts on the held-out test set (NMD n = 2,268, Control n = 7,863). Each transcript's AUG and stop windows are centered on its main ORF's start and stop codons. Main ORFs are chosen with the following priority: the annotated reference CDS (projected from the gene's dominant non-NMD isoform) when available; otherwise the TransDecoder2-called CDS; otherwise the highest-Kozak-scoring ORF (see Methods, Main ORF selection). Values are smoothed with an 11-nt rolling mean over the raw per-position |SHAP| to abstract over trinucleotide-frame periodicity. A) AUG window covering positions –250 to +249 relative to the start codon. B) Stop codon window covering the same relative range around the stop codon. Pooled across 5 DeepSHAP runs (500 background samples each). Abbreviations. nt, nucleotides; ORF, open reading frame.</w:t>
+        <w:t xml:space="preserve">SF36 | Total |SHAP| Across the Start and Stop Codon Windows. </w:t>
+      </w:r>
+      <w:r>
+        <w:t xml:space="preserve">Per-position |SHAP| summed across the nine input channels of the deep-learning model, comparing NMD susceptible (orange) and Control (blue) transcripts on the held-out test set (NMD n = 2,268, Control n = 7,863). Each transcript's AUG and stop windows are centered on its main ORF's start and stop codons. Main ORFs are chosen with the following priority: the annotated reference CDS (projected from the gene's dominant non-NMD isoform) when available; otherwise the TransDecoder2-called CDS; otherwise the highest-Kozak-scoring ORF (see Methods, Main ORF selection). Values are smoothed with an 11-nt rolling mean over the raw per-position |SHAP| to abstract over trinucleotide-frame periodicity. A) Start window covering positions –250 to +249 relative to the start codon. B) Stop codon window covering the same relative range around the stop codon. Pooled across 5 DeepSHAP runs (500 background samples each). Abbreviations. nt, nucleotides; ORF, open reading frame.</w:t>
       </w:r>
     </w:p>
     <w:p>

</xml_diff>

<commit_message>
SF legend/figure review batch 2: start-codon wording + splice-event abbreviations
- SF34/SF35: Panel B x-axis + legend say 'start codon' (was AUG/CDS);
  labels wrapped to two lines to avoid tick overlap.
- SF36 legend: brief panel-content gloss after '(see SF34)'.
- SF37: 'start codon window' / 'stop codon window' in facet headers + legend.
- SF25: 'exon skipping (SE, ...)'; 'Partial intron retention, 5'/3' side (Partial IR 5'/3')'.
- Rebuilt SF docx + PDF; lint_sf_legends clean.

Co-Authored-By: Claude Opus 4.8 <noreply@anthropic.com>
</commit_message>
<xml_diff>
--- a/paper/nmd_supplemental_figures_sf24_sf42.docx
+++ b/paper/nmd_supplemental_figures_sf24_sf42.docx
@@ -73,7 +73,7 @@
         <w:t xml:space="preserve">SF25 | Twelve Isopair Splice Event Categories. </w:t>
       </w:r>
       <w:r>
-        <w:t xml:space="preserve">Schematic of the twelve splice-event types identified when comparing a paired isoform (Comparator, bottom track) to the gene's dominant non-NMD isoform (Reference, top track). Gray boxes, exons; horizontal lines with chevrons, introns (chevrons point in the direction of transcription, 5′ → 3′). Categories: transcript-end variants (Alt TSS, Alt TES); alternative splice sites (A5SS, A3SS); exon skipping (Skipped Exon, Missing Internal); and intron retention in six forms (Partial IR 5′, Partial IR 3′, Full IR, IR diff 5′, IR diff 3′, IR diff 5′ + 3′).</w:t>
+        <w:t xml:space="preserve">Schematic of the twelve splice-event types identified when comparing a paired isoform (Comparator, bottom track) to the gene's dominant non-NMD isoform (Reference, top track). Gray boxes, exons; horizontal lines with chevrons, introns (chevrons point in the direction of transcription, 5′ → 3′). Categories: transcript-end variants (Alt TSS, Alt TES); alternative splice sites (A5SS, A3SS); exon skipping (SE, Missing Internal); and intron retention in six forms (Partial IR 5′, Partial IR 3′, Full IR, IR diff 5′, IR diff 3′, IR diff 5′ + 3′).</w:t>
       </w:r>
     </w:p>
     <w:p>
@@ -751,7 +751,7 @@
         <w:t xml:space="preserve">SF34 | TD2 Versus Reference AUG-Traced ORFs, Reference AUG-Traceable Cohort. </w:t>
       </w:r>
       <w:r>
-        <w:t xml:space="preserve">n = 819 gene-matched NMD comparator pairs. (A) ORF-length distribution under the TD2 call versus under the reference AUG projected onto the same transcript. (B) Paired Kozak PWM score at the reference AUG versus at the TD2-predicted start codon. (C) Position of the TD2 AUG relative to the reference AUG (0 = same site). Solid black bar inside each violin, median. Abbreviations. ORF, open reading frame; PWM, position weight matrix; TD2, TransDecoder2.</w:t>
+        <w:t xml:space="preserve">n = 819 gene-matched NMD comparator pairs. (A) ORF-length distribution under the TD2 call versus under the reference AUG projected onto the same transcript. (B) Paired Kozak PWM score at the reference start codon versus at the TD2-predicted start codon. (C) Position of the TD2 start codon relative to the reference AUG (0 = same site). Solid black bar inside each violin, median. Abbreviations. ORF, open reading frame; PWM, position weight matrix; TD2, TransDecoder2.</w:t>
       </w:r>
     </w:p>
     <w:p>
@@ -817,7 +817,7 @@
         <w:t xml:space="preserve">SF35 | TD2 Versus Reference AUG-Traced ORFs, Occult-PTC Subset. </w:t>
       </w:r>
       <w:r>
-        <w:t xml:space="preserve">Restricted to the n = 348 comparators in which projecting the reference AUG revealed a PTC that the TD2 CDS call did not. (A) ORF-length distribution, TD2 call vs reference AUG projected onto the same transcript. (B) Paired Kozak PWM score at the reference AUG vs the TD2-predicted start codon. (C) Position of the TD2 start codon relative to the reference AUG (0 = same site). Abbreviations. CDS, coding sequence; ORF, open reading frame; PTC, premature termination codon; TD2, TransDecoder2.</w:t>
+        <w:t xml:space="preserve">Restricted to the n = 348 comparators in which projecting the reference AUG revealed a PTC that the TD2 CDS call did not. (A) ORF-length distribution, TD2 call vs reference AUG projected onto the same transcript. (B) Paired Kozak PWM score at the reference start codon vs the TD2-predicted start codon. (C) Position of the TD2 start codon relative to the reference AUG (0 = same site). Abbreviations. CDS, coding sequence; ORF, open reading frame; PTC, premature termination codon; TD2, TransDecoder2.</w:t>
       </w:r>
     </w:p>
     <w:p>
@@ -883,7 +883,7 @@
         <w:t xml:space="preserve">SF36 | CDS and 3′UTR Length Across Isoform Classes, Reference AUG-Traceable Cohort. </w:t>
       </w:r>
       <w:r>
-        <w:t xml:space="preserve">Restricted to gene-matched pairs in which the reference AUG projects onto the comparator transcript (n = 756 NMD+/PTC+, 63 NMD+/PTC−, 819 Control). Stop anchor: the reference gene's AUG projected onto the comparator, which is unbiased with respect to TD2's PTC-avoidance (see SF34). Solid black bar inside each violin, median. (Panel C NMD+/PTC+ n = 751; comparators without a downstream non-premature stop are dropped.) Two-sided Wilcoxon rank-sum: </w:t>
+        <w:t xml:space="preserve">Restricted to gene-matched pairs in which the reference AUG projects onto the comparator transcript (n = 756 NMD+/PTC+, 63 NMD+/PTC−, 819 Control). Stop anchor: the reference gene's AUG projected onto the comparator, which is unbiased with respect to TD2's PTC-avoidance (see SF34). (A) CDS length; (B) 3′UTR length from the annotated stop; (C) 3′UTR length past the first non-premature stop. Solid black bar inside each violin, median. (Panel C NMD+/PTC+ n = 751; comparators without a downstream non-premature stop are dropped.) Two-sided Wilcoxon rank-sum: </w:t>
       </w:r>
       <w:r>
         <w:t xml:space="preserve">*</w:t>
@@ -943,7 +943,7 @@
           <wp:inline distT="0" distB="0" distL="0" distR="0">
             <wp:extent cx="5943600" cy="2476500"/>
             <wp:effectExtent t="0" r="0" b="0" l="0"/>
-            <wp:docPr id="1" name="SF37_ShapAcrossWindows" descr="SF37 | Total |SHAP| Across the Start and Stop Codon Windows." title="SF37 | Total |SHAP| Across the Start and Stop Codon Windows."/>
+            <wp:docPr id="1" name="SF37_ShapAcrossWindows" descr="SF37 | Total |SHAP| Across the Start Codon and Stop Codon Windows." title="SF37 | Total |SHAP| Across the Start Codon and Stop Codon Windows."/>
             <wp:cNvGraphicFramePr>
               <a:graphicFrameLocks xmlns:a="http://schemas.openxmlformats.org/drawingml/2006/main" noChangeAspect="1"/>
             </wp:cNvGraphicFramePr>
@@ -988,10 +988,10 @@
           <w:b/>
           <w:bCs/>
         </w:rPr>
-        <w:t xml:space="preserve">SF37 | Total |SHAP| Across the Start and Stop Codon Windows. </w:t>
-      </w:r>
-      <w:r>
-        <w:t xml:space="preserve">Per-position |SHAP| summed across the nine input channels of the deep-learning model, comparing NMD susceptible (orange) and Control (blue) transcripts on the held-out test set (NMD n = 2,268, Control n = 7,863). Each transcript's AUG and stop windows are centered on its main ORF's start and stop codons. Main ORFs are chosen with the following priority: the annotated reference CDS (projected from the gene's dominant non-NMD isoform) when available; otherwise the TransDecoder2-called CDS; otherwise the highest-Kozak-scoring ORF (see Methods, Main ORF selection). Values are smoothed with an 11-nt rolling mean over the raw per-position |SHAP| to abstract over trinucleotide-frame periodicity. A) Start window covering positions –250 to +249 relative to the start codon. B) Stop codon window covering the same relative range around the stop codon. Pooled across 5 DeepSHAP runs (500 background samples each). Abbreviations. nt, nucleotides; ORF, open reading frame.</w:t>
+        <w:t xml:space="preserve">SF37 | Total |SHAP| Across the Start Codon and Stop Codon Windows. </w:t>
+      </w:r>
+      <w:r>
+        <w:t xml:space="preserve">Per-position |SHAP| summed across the nine input channels of the deep-learning model, comparing NMD susceptible (orange) and Control (blue) transcripts on the held-out test set (NMD n = 2,268, Control n = 7,863). Each transcript's start codon and stop codon windows are centered on its main ORF's start and stop codons. Main ORFs are chosen with the following priority: the annotated reference CDS (projected from the gene's dominant non-NMD isoform) when available; otherwise the TransDecoder2-called CDS; otherwise the highest-Kozak-scoring ORF (see Methods, Main ORF selection). Values are smoothed with an 11-nt rolling mean over the raw per-position |SHAP| to abstract over trinucleotide-frame periodicity. A) Start codon window covering positions –250 to +249 relative to the start codon. B) Stop codon window covering the same relative range around the stop codon. Pooled across 5 DeepSHAP runs (500 background samples each). Abbreviations. nt, nucleotides; ORF, open reading frame.</w:t>
       </w:r>
     </w:p>
     <w:p>

</xml_diff>

<commit_message>
SF renumber: rotate SF26-29 + retitle to match assembled supplement
Yul's assembled supplement reordered the Isopair descriptive figures, so my
SF26-29 rotate (flowchart moves up to SF26; the three descriptives shift +1):
  SF29 PairAnalysisFlowchart  -> SF26  'Isopair Analysis Data Flow'
  SF26 IsoformsPerGene        -> SF27  'Isoform Count in Isoform Pair Sets'
  SF27 ReferenceShare         -> SF28  'Expression Levels of Isoform Pair Sets'
  SF28 TranscriptLengthByRole -> SF29  'Transcript Length Comparison'
  SF25                                 retitled 'Isopair Splice Events'
SF30-43 unchanged. Collision-safe rotation (temp tokens) across folders,
basenames, legend #+titles, figure-script self-refs, docx manifest (reordered),
results_to_code_map; flowchart re-rendered (now draws SF27-36); docx+PDF rebuilt.
Linter clean; folder#=legend#=title=basename verified for all five.

Co-Authored-By: Claude Opus 4.8 <noreply@anthropic.com>
</commit_message>
<xml_diff>
--- a/paper/nmd_supplemental_figures_sf24_sf42.docx
+++ b/paper/nmd_supplemental_figures_sf24_sf42.docx
@@ -25,7 +25,7 @@
           <wp:inline distT="0" distB="0" distL="0" distR="0">
             <wp:extent cx="5943600" cy="4800600"/>
             <wp:effectExtent t="0" r="0" b="0" l="0"/>
-            <wp:docPr id="1" name="SF25_SpliceEventCategories" descr="SF25 | Twelve Isopair Splice Event Categories." title="SF25 | Twelve Isopair Splice Event Categories."/>
+            <wp:docPr id="1" name="SF25_SpliceEventCategories" descr="SF25 | Isopair Splice Events." title="SF25 | Isopair Splice Events."/>
             <wp:cNvGraphicFramePr>
               <a:graphicFrameLocks xmlns:a="http://schemas.openxmlformats.org/drawingml/2006/main" noChangeAspect="1"/>
             </wp:cNvGraphicFramePr>
@@ -70,7 +70,7 @@
           <w:b/>
           <w:bCs/>
         </w:rPr>
-        <w:t xml:space="preserve">SF25 | Twelve Isopair Splice Event Categories. </w:t>
+        <w:t xml:space="preserve">SF25 | Isopair Splice Events. </w:t>
       </w:r>
       <w:r>
         <w:t xml:space="preserve">Schematic of the twelve splice-event types identified when comparing a paired isoform (Comparator, bottom track) to the gene's dominant non-NMD isoform (Reference, top track). Gray boxes, exons; horizontal lines with chevrons, introns (chevrons point in the direction of transcription, 5′ → 3′). Categories: transcript-end variants (Alt TSS, Alt TES); alternative splice sites (A5SS, A3SS); exon skipping (SE, Missing Internal); and intron retention in six forms (Partial IR 5′, Partial IR 3′, Full IR, IR diff 5′, IR diff 3′, IR diff 5′ + 3′).</w:t>
@@ -89,23 +89,89 @@
       <w:r>
         <w:drawing>
           <wp:inline distT="0" distB="0" distL="0" distR="0">
+            <wp:extent cx="5943600" cy="6381750"/>
+            <wp:effectExtent t="0" r="0" b="0" l="0"/>
+            <wp:docPr id="1" name="SF26_PairAnalysisFlowchart" descr="SF26 | Isopair Analysis Data Flow." title="SF26 | Isopair Analysis Data Flow."/>
+            <wp:cNvGraphicFramePr>
+              <a:graphicFrameLocks xmlns:a="http://schemas.openxmlformats.org/drawingml/2006/main" noChangeAspect="1"/>
+            </wp:cNvGraphicFramePr>
+            <a:graphic xmlns:a="http://schemas.openxmlformats.org/drawingml/2006/main">
+              <a:graphicData uri="http://schemas.openxmlformats.org/drawingml/2006/picture">
+                <pic:pic xmlns:pic="http://schemas.openxmlformats.org/drawingml/2006/picture">
+                  <pic:nvPicPr>
+                    <pic:cNvPr id="0" name="" descr=""/>
+                    <pic:cNvPicPr>
+                      <a:picLocks noChangeAspect="1" noChangeArrowheads="1"/>
+                    </pic:cNvPicPr>
+                  </pic:nvPicPr>
+                  <pic:blipFill>
+                    <a:blip r:embed="rId8" cstate="none"/>
+                    <a:srcRect/>
+                    <a:stretch>
+                      <a:fillRect/>
+                    </a:stretch>
+                  </pic:blipFill>
+                  <pic:spPr bwMode="auto">
+                    <a:xfrm>
+                      <a:off x="0" y="0"/>
+                      <a:ext cx="5943600" cy="6381750"/>
+                    </a:xfrm>
+                    <a:prstGeom prst="rect">
+                      <a:avLst/>
+                    </a:prstGeom>
+                  </pic:spPr>
+                </pic:pic>
+              </a:graphicData>
+            </a:graphic>
+          </wp:inline>
+        </w:drawing>
+      </w:r>
+    </w:p>
+    <w:p>
+      <w:pPr>
+        <w:spacing w:after="120"/>
+      </w:pPr>
+      <w:r>
+        <w:rPr>
+          <w:b/>
+          <w:bCs/>
+        </w:rPr>
+        <w:t xml:space="preserve">SF26 | Isopair Analysis Data Flow. </w:t>
+      </w:r>
+      <w:r>
+        <w:t xml:space="preserve">Data flow for the isoform pairs analyses. Every filter step shows the number of pairs kept and dropped, and a one-line description of why each dropout happened.</w:t>
+      </w:r>
+    </w:p>
+    <w:p>
+      <w:pPr>
+        <w:spacing w:after="240"/>
+      </w:pPr>
+    </w:p>
+    <w:p>
+      <w:pPr>
+        <w:spacing w:after="60" w:before="120"/>
+        <w:jc w:val="center"/>
+      </w:pPr>
+      <w:r>
+        <w:drawing>
+          <wp:inline distT="0" distB="0" distL="0" distR="0">
             <wp:extent cx="5943600" cy="3657600"/>
             <wp:effectExtent t="0" r="0" b="0" l="0"/>
-            <wp:docPr id="1" name="SF26_IsoformsPerGene" descr="SF26 | Isoforms per Gene in Isopair Analysis." title="SF26 | Isoforms per Gene in Isopair Analysis."/>
-            <wp:cNvGraphicFramePr>
-              <a:graphicFrameLocks xmlns:a="http://schemas.openxmlformats.org/drawingml/2006/main" noChangeAspect="1"/>
-            </wp:cNvGraphicFramePr>
-            <a:graphic xmlns:a="http://schemas.openxmlformats.org/drawingml/2006/main">
-              <a:graphicData uri="http://schemas.openxmlformats.org/drawingml/2006/picture">
-                <pic:pic xmlns:pic="http://schemas.openxmlformats.org/drawingml/2006/picture">
-                  <pic:nvPicPr>
-                    <pic:cNvPr id="0" name="" descr=""/>
-                    <pic:cNvPicPr>
-                      <a:picLocks noChangeAspect="1" noChangeArrowheads="1"/>
-                    </pic:cNvPicPr>
-                  </pic:nvPicPr>
-                  <pic:blipFill>
-                    <a:blip r:embed="rId8" cstate="none"/>
+            <wp:docPr id="1" name="SF27_IsoformsPerGene" descr="SF27 | Isoform Count in Isoform Pair Sets." title="SF27 | Isoform Count in Isoform Pair Sets."/>
+            <wp:cNvGraphicFramePr>
+              <a:graphicFrameLocks xmlns:a="http://schemas.openxmlformats.org/drawingml/2006/main" noChangeAspect="1"/>
+            </wp:cNvGraphicFramePr>
+            <a:graphic xmlns:a="http://schemas.openxmlformats.org/drawingml/2006/main">
+              <a:graphicData uri="http://schemas.openxmlformats.org/drawingml/2006/picture">
+                <pic:pic xmlns:pic="http://schemas.openxmlformats.org/drawingml/2006/picture">
+                  <pic:nvPicPr>
+                    <pic:cNvPr id="0" name="" descr=""/>
+                    <pic:cNvPicPr>
+                      <a:picLocks noChangeAspect="1" noChangeArrowheads="1"/>
+                    </pic:cNvPicPr>
+                  </pic:nvPicPr>
+                  <pic:blipFill>
+                    <a:blip r:embed="rId9" cstate="none"/>
                     <a:srcRect/>
                     <a:stretch>
                       <a:fillRect/>
@@ -136,7 +202,7 @@
           <w:b/>
           <w:bCs/>
         </w:rPr>
-        <w:t xml:space="preserve">SF26 | Isoforms per Gene in Isopair Analysis. </w:t>
+        <w:t xml:space="preserve">SF27 | Isoform Count in Isoform Pair Sets. </w:t>
       </w:r>
       <w:r>
         <w:t xml:space="preserve">Distribution of the number of expressed isoforms per gene across the 1,548 genes for which gene-matched NMD susceptible / reference / non-NMD isoform triplets could be constructed. The median gene contributes 6 isoforms (dashed line). Counts include all long-read isoforms passing the expression filter in at least one of the four cell types (AT2, LAE, FB, MV) under DMSO.</w:t>
@@ -157,21 +223,21 @@
           <wp:inline distT="0" distB="0" distL="0" distR="0">
             <wp:extent cx="5943600" cy="3657600"/>
             <wp:effectExtent t="0" r="0" b="0" l="0"/>
-            <wp:docPr id="1" name="SF27_ReferenceShare" descr="SF27 | Reference Share of Gene Expression." title="SF27 | Reference Share of Gene Expression."/>
-            <wp:cNvGraphicFramePr>
-              <a:graphicFrameLocks xmlns:a="http://schemas.openxmlformats.org/drawingml/2006/main" noChangeAspect="1"/>
-            </wp:cNvGraphicFramePr>
-            <a:graphic xmlns:a="http://schemas.openxmlformats.org/drawingml/2006/main">
-              <a:graphicData uri="http://schemas.openxmlformats.org/drawingml/2006/picture">
-                <pic:pic xmlns:pic="http://schemas.openxmlformats.org/drawingml/2006/picture">
-                  <pic:nvPicPr>
-                    <pic:cNvPr id="0" name="" descr=""/>
-                    <pic:cNvPicPr>
-                      <a:picLocks noChangeAspect="1" noChangeArrowheads="1"/>
-                    </pic:cNvPicPr>
-                  </pic:nvPicPr>
-                  <pic:blipFill>
-                    <a:blip r:embed="rId9" cstate="none"/>
+            <wp:docPr id="1" name="SF28_ReferenceShare" descr="SF28 | Expression Levels of Isoform Pair Sets." title="SF28 | Expression Levels of Isoform Pair Sets."/>
+            <wp:cNvGraphicFramePr>
+              <a:graphicFrameLocks xmlns:a="http://schemas.openxmlformats.org/drawingml/2006/main" noChangeAspect="1"/>
+            </wp:cNvGraphicFramePr>
+            <a:graphic xmlns:a="http://schemas.openxmlformats.org/drawingml/2006/main">
+              <a:graphicData uri="http://schemas.openxmlformats.org/drawingml/2006/picture">
+                <pic:pic xmlns:pic="http://schemas.openxmlformats.org/drawingml/2006/picture">
+                  <pic:nvPicPr>
+                    <pic:cNvPr id="0" name="" descr=""/>
+                    <pic:cNvPicPr>
+                      <a:picLocks noChangeAspect="1" noChangeArrowheads="1"/>
+                    </pic:cNvPicPr>
+                  </pic:nvPicPr>
+                  <pic:blipFill>
+                    <a:blip r:embed="rId10" cstate="none"/>
                     <a:srcRect/>
                     <a:stretch>
                       <a:fillRect/>
@@ -202,7 +268,7 @@
           <w:b/>
           <w:bCs/>
         </w:rPr>
-        <w:t xml:space="preserve">SF27 | Reference Share of Gene Expression. </w:t>
+        <w:t xml:space="preserve">SF28 | Expression Levels of Isoform Pair Sets. </w:t>
       </w:r>
       <w:r>
         <w:t xml:space="preserve">Distribution across 1,548 genes (each contributing a gene-matched NMD susceptible / reference / non-NMD isoform triplet) of the reference isoform's mean DMSO expression as a fraction of the gene's total isoform expression. Reference isoforms are the highest-expressed non-NMD isoform per gene in DMSO (mean across the four cell types). Dashed line, median; solid line, 25% retention floor.</w:t>
@@ -223,21 +289,21 @@
           <wp:inline distT="0" distB="0" distL="0" distR="0">
             <wp:extent cx="5943600" cy="4200525"/>
             <wp:effectExtent t="0" r="0" b="0" l="0"/>
-            <wp:docPr id="1" name="SF28_TranscriptLengthByRole" descr="SF28 | Transcript Length by Isopair Analysis Category." title="SF28 | Transcript Length by Isopair Analysis Category."/>
-            <wp:cNvGraphicFramePr>
-              <a:graphicFrameLocks xmlns:a="http://schemas.openxmlformats.org/drawingml/2006/main" noChangeAspect="1"/>
-            </wp:cNvGraphicFramePr>
-            <a:graphic xmlns:a="http://schemas.openxmlformats.org/drawingml/2006/main">
-              <a:graphicData uri="http://schemas.openxmlformats.org/drawingml/2006/picture">
-                <pic:pic xmlns:pic="http://schemas.openxmlformats.org/drawingml/2006/picture">
-                  <pic:nvPicPr>
-                    <pic:cNvPr id="0" name="" descr=""/>
-                    <pic:cNvPicPr>
-                      <a:picLocks noChangeAspect="1" noChangeArrowheads="1"/>
-                    </pic:cNvPicPr>
-                  </pic:nvPicPr>
-                  <pic:blipFill>
-                    <a:blip r:embed="rId10" cstate="none"/>
+            <wp:docPr id="1" name="SF29_TranscriptLengthByRole" descr="SF29 | Transcript Length Comparison." title="SF29 | Transcript Length Comparison."/>
+            <wp:cNvGraphicFramePr>
+              <a:graphicFrameLocks xmlns:a="http://schemas.openxmlformats.org/drawingml/2006/main" noChangeAspect="1"/>
+            </wp:cNvGraphicFramePr>
+            <a:graphic xmlns:a="http://schemas.openxmlformats.org/drawingml/2006/main">
+              <a:graphicData uri="http://schemas.openxmlformats.org/drawingml/2006/picture">
+                <pic:pic xmlns:pic="http://schemas.openxmlformats.org/drawingml/2006/picture">
+                  <pic:nvPicPr>
+                    <pic:cNvPr id="0" name="" descr=""/>
+                    <pic:cNvPicPr>
+                      <a:picLocks noChangeAspect="1" noChangeArrowheads="1"/>
+                    </pic:cNvPicPr>
+                  </pic:nvPicPr>
+                  <pic:blipFill>
+                    <a:blip r:embed="rId11" cstate="none"/>
                     <a:srcRect/>
                     <a:stretch>
                       <a:fillRect/>
@@ -268,7 +334,7 @@
           <w:b/>
           <w:bCs/>
         </w:rPr>
-        <w:t xml:space="preserve">SF28 | Transcript Length by Isopair Analysis Category. </w:t>
+        <w:t xml:space="preserve">SF29 | Transcript Length Comparison. </w:t>
       </w:r>
       <w:r>
         <w:t xml:space="preserve">Violin plot of transcript length (log10 nt) for the 1,548 gene-matched isoform triplets: NMD comparator (orange), Reference (gray), Control comparator (blue). Reference is the highest-expressed non-NMD isoform per gene under DMSO across the four cell types (AT2, LAE, FB, MV); the NMD and Control comparators are the paired NMD susceptible and non-NMD non-reference isoforms from the same gene. Solid black bar, median. Abbreviations. nt, nucleotides.</w:t>
@@ -287,72 +353,6 @@
       <w:r>
         <w:drawing>
           <wp:inline distT="0" distB="0" distL="0" distR="0">
-            <wp:extent cx="5943600" cy="6381750"/>
-            <wp:effectExtent t="0" r="0" b="0" l="0"/>
-            <wp:docPr id="1" name="SF29_PairAnalysisFlowchart" descr="SF29 | Isopair Analysis Flowchart." title="SF29 | Isopair Analysis Flowchart."/>
-            <wp:cNvGraphicFramePr>
-              <a:graphicFrameLocks xmlns:a="http://schemas.openxmlformats.org/drawingml/2006/main" noChangeAspect="1"/>
-            </wp:cNvGraphicFramePr>
-            <a:graphic xmlns:a="http://schemas.openxmlformats.org/drawingml/2006/main">
-              <a:graphicData uri="http://schemas.openxmlformats.org/drawingml/2006/picture">
-                <pic:pic xmlns:pic="http://schemas.openxmlformats.org/drawingml/2006/picture">
-                  <pic:nvPicPr>
-                    <pic:cNvPr id="0" name="" descr=""/>
-                    <pic:cNvPicPr>
-                      <a:picLocks noChangeAspect="1" noChangeArrowheads="1"/>
-                    </pic:cNvPicPr>
-                  </pic:nvPicPr>
-                  <pic:blipFill>
-                    <a:blip r:embed="rId11" cstate="none"/>
-                    <a:srcRect/>
-                    <a:stretch>
-                      <a:fillRect/>
-                    </a:stretch>
-                  </pic:blipFill>
-                  <pic:spPr bwMode="auto">
-                    <a:xfrm>
-                      <a:off x="0" y="0"/>
-                      <a:ext cx="5943600" cy="6381750"/>
-                    </a:xfrm>
-                    <a:prstGeom prst="rect">
-                      <a:avLst/>
-                    </a:prstGeom>
-                  </pic:spPr>
-                </pic:pic>
-              </a:graphicData>
-            </a:graphic>
-          </wp:inline>
-        </w:drawing>
-      </w:r>
-    </w:p>
-    <w:p>
-      <w:pPr>
-        <w:spacing w:after="120"/>
-      </w:pPr>
-      <w:r>
-        <w:rPr>
-          <w:b/>
-          <w:bCs/>
-        </w:rPr>
-        <w:t xml:space="preserve">SF29 | Isopair Analysis Flowchart. </w:t>
-      </w:r>
-      <w:r>
-        <w:t xml:space="preserve">Data flow for the isoform pairs analyses. Every filter step shows the number of pairs kept and dropped, and a one-line description of why each dropout happened.</w:t>
-      </w:r>
-    </w:p>
-    <w:p>
-      <w:pPr>
-        <w:spacing w:after="240"/>
-      </w:pPr>
-    </w:p>
-    <w:p>
-      <w:pPr>
-        <w:spacing w:after="60" w:before="120"/>
-        <w:jc w:val="center"/>
-      </w:pPr>
-      <w:r>
-        <w:drawing>
-          <wp:inline distT="0" distB="0" distL="0" distR="0">
             <wp:extent cx="5943600" cy="2914650"/>
             <wp:effectExtent t="0" r="0" b="0" l="0"/>
             <wp:docPr id="1" name="SF30_GainDirectionByEvent" descr="SF30 | Gain Direction by Splice Event Type." title="SF30 | Gain Direction by Splice Event Type."/>
@@ -511,7 +511,7 @@
         <w:t xml:space="preserve">SF31 | NMD-Response Magnitude vs Stop Codon Distance to Last EJC. </w:t>
       </w:r>
       <w:r>
-        <w:t xml:space="preserve">Per-comparator NMD-response magnitude (mashr posterior-mean log₂ fold-change under SMG1 inhibition, averaged across AT2, LAE, FB and MV) plotted against the distance from the comparator's stop codon to the transcript's last EJC. Positive values, stop codon upstream of the last EJC (candidate NMD substrate); negative values, stop codon downstream of the last EJC. Gray points, individual comparators (1st–99th percentile of x-axis shown); orange line, local-linear smoother; orange band, bootstrap 95% CI. Dashed red line, the operational 50-nt PTC threshold. Population: n = 819 comparators (reference AUG-traceable subset from SF29). Stop anchor: reference AUG-traced (the first in-frame stop reached after projecting the reference gene's AUG onto the comparator); this avoids the attenuation that would arise from TD2 anchoring on non-PTC main ORFs. Median log₂ fold-change is 2.19 above the 50-nt threshold and 1.08 at or below it (Wilcoxon one-sided p = 3.7 × 10⁻¹³). Abbreviations. EJC, exon junction complex; nt, nucleotides; ORF, open reading frame.</w:t>
+        <w:t xml:space="preserve">Per-comparator NMD-response magnitude (mashr posterior-mean log₂ fold-change under SMG1 inhibition, averaged across AT2, LAE, FB and MV) plotted against the distance from the comparator's stop codon to the transcript's last EJC. Positive values, stop codon upstream of the last EJC (candidate NMD substrate); negative values, stop codon downstream of the last EJC. Gray points, individual comparators (1st–99th percentile of x-axis shown); orange line, local-linear smoother; orange band, bootstrap 95% CI. Dashed red line, the operational 50-nt PTC threshold. Population: n = 819 comparators (reference AUG-traceable subset from SF26). Stop anchor: reference AUG-traced (the first in-frame stop reached after projecting the reference gene's AUG onto the comparator); this avoids the attenuation that would arise from TD2 anchoring on non-PTC main ORFs. Median log₂ fold-change is 2.19 above the 50-nt threshold and 1.08 at or below it (Wilcoxon one-sided p = 3.7 × 10⁻¹³). Abbreviations. EJC, exon junction complex; nt, nucleotides; ORF, open reading frame.</w:t>
       </w:r>
     </w:p>
     <w:p>
@@ -577,7 +577,7 @@
         <w:t xml:space="preserve">SF32 | NMD Effect Size by Downstream EJC Count in PTC-Positive NMD Comparators. </w:t>
       </w:r>
       <w:r>
-        <w:t xml:space="preserve">Distribution of NMD-response magnitude (mashr posterior-mean log₂ fold-change under SMG1 inhibition, averaged across AT2, LAE, FB and MV) as a function of the number of EJCs downstream of the comparator's stop codon. Restricted to comparators with at least one downstream EJC (n = 756) from the reference AUG-traceable subset from SF29. Downstream-EJC counts of 7 or more are collapsed into a single "7+" bin. Violin, kernel density; overlaid box, interquartile range and median; red line, per-bin median trend. Per-bin sample counts are shown above each violin. Stop anchor: reference AUG-traced, matching SF31. Abbreviations. EJC, exon junction complex; PTC, premature termination codon; nt, nucleotides.</w:t>
+        <w:t xml:space="preserve">Distribution of NMD-response magnitude (mashr posterior-mean log₂ fold-change under SMG1 inhibition, averaged across AT2, LAE, FB and MV) as a function of the number of EJCs downstream of the comparator's stop codon. Restricted to comparators with at least one downstream EJC (n = 756) from the reference AUG-traceable subset from SF26. Downstream-EJC counts of 7 or more are collapsed into a single "7+" bin. Violin, kernel density; overlaid box, interquartile range and median; red line, per-bin median trend. Per-bin sample counts are shown above each violin. Stop anchor: reference AUG-traced, matching SF31. Abbreviations. EJC, exon junction complex; PTC, premature termination codon; nt, nucleotides.</w:t>
       </w:r>
     </w:p>
     <w:p>

</xml_diff>

<commit_message>
SF28: retitle 'Expression Levels of Isoform Pair Sets' -> 'Reference Isoform Share of Gene Expression'
The panel plots the reference isoform's fraction of total gene expression (not
expression levels); new title matches the axis. Legend + results_to_code_map
updated; docx/PDF rebuilt.

Co-Authored-By: Claude Opus 4.8 <noreply@anthropic.com>
</commit_message>
<xml_diff>
--- a/paper/nmd_supplemental_figures_sf24_sf42.docx
+++ b/paper/nmd_supplemental_figures_sf24_sf42.docx
@@ -223,7 +223,7 @@
           <wp:inline distT="0" distB="0" distL="0" distR="0">
             <wp:extent cx="5943600" cy="3657600"/>
             <wp:effectExtent t="0" r="0" b="0" l="0"/>
-            <wp:docPr id="1" name="SF28_ReferenceShare" descr="SF28 | Expression Levels of Isoform Pair Sets." title="SF28 | Expression Levels of Isoform Pair Sets."/>
+            <wp:docPr id="1" name="SF28_ReferenceShare" descr="SF28 | Reference Isoform Share of Gene Expression." title="SF28 | Reference Isoform Share of Gene Expression."/>
             <wp:cNvGraphicFramePr>
               <a:graphicFrameLocks xmlns:a="http://schemas.openxmlformats.org/drawingml/2006/main" noChangeAspect="1"/>
             </wp:cNvGraphicFramePr>
@@ -268,7 +268,7 @@
           <w:b/>
           <w:bCs/>
         </w:rPr>
-        <w:t xml:space="preserve">SF28 | Expression Levels of Isoform Pair Sets. </w:t>
+        <w:t xml:space="preserve">SF28 | Reference Isoform Share of Gene Expression. </w:t>
       </w:r>
       <w:r>
         <w:t xml:space="preserve">Distribution across 1,548 genes (each contributing a gene-matched NMD susceptible / reference / non-NMD isoform triplet) of the reference isoform's mean DMSO expression as a fraction of the gene's total isoform expression. Reference isoforms are the highest-expressed non-NMD isoform per gene in DMSO (mean across the four cell types). Dashed line, median; solid line, 25% retention floor.</w:t>

</xml_diff>